<commit_message>
docs(scoring): titulos de seccion mas descriptivos en el reporte Word
Reemplaza H2 genericos o con jerga (EDA, riesgo_bajo_desempeno) por
titulos que explican que aporta cada seccion, y ajusta los H1 para
evitar duplicacion con los H2 inmediatos.
</commit_message>
<xml_diff>
--- a/tp_scoring/reporte_scoring.docx
+++ b/tp_scoring/reporte_scoring.docx
@@ -36,229 +36,748 @@
     </w:p>
     <w:p>
       <w:pPr>
-        <w:pStyle w:val="Heading2"/>
+        <w:pStyle w:val="Heading1"/>
       </w:pPr>
       <w:r>
         <w:rPr>
           <w:color w:val="2C3E50"/>
         </w:rPr>
-        <w:t>6. Actividades que deberán realizar</w:t>
-      </w:r>
-    </w:p>
-    <w:p>
-      <w:r>
-        <w:rPr>
-          <w:sz w:val="22"/>
-        </w:rPr>
-        <w:t xml:space="preserve"> 1. Definir el problema de negocio o académico que se quiere apoyar con un</w:t>
-      </w:r>
-    </w:p>
-    <w:p>
-      <w:r>
-        <w:rPr>
-          <w:sz w:val="22"/>
-        </w:rPr>
-        <w:t xml:space="preserve">    score.</w:t>
-      </w:r>
-    </w:p>
-    <w:p>
-      <w:r>
-        <w:rPr>
-          <w:sz w:val="22"/>
-        </w:rPr>
-        <w:t xml:space="preserve"> 2. Identificar la unidad de análisis (cliente, estudiante, transacción, etc.).</w:t>
-      </w:r>
-    </w:p>
-    <w:p>
-      <w:r>
-        <w:rPr>
-          <w:sz w:val="22"/>
-        </w:rPr>
-        <w:t xml:space="preserve"> 3. Determinar qué significa el score (ej. probabilidad de fraude, riesgo de</w:t>
-      </w:r>
-    </w:p>
-    <w:p>
-      <w:r>
-        <w:rPr>
-          <w:sz w:val="22"/>
-        </w:rPr>
-        <w:t xml:space="preserve">    abandono, propensión a comprar).</w:t>
-      </w:r>
-    </w:p>
-    <w:p>
-      <w:r>
-        <w:rPr>
-          <w:sz w:val="22"/>
-        </w:rPr>
-        <w:t xml:space="preserve"> 4. Explorar el dataset propuesto: estadísticas descriptivas, valores faltantes,</w:t>
-      </w:r>
-    </w:p>
-    <w:p>
-      <w:r>
-        <w:rPr>
-          <w:sz w:val="22"/>
-        </w:rPr>
-        <w:t xml:space="preserve">    correlaciones.</w:t>
-      </w:r>
-    </w:p>
-    <w:p>
-      <w:r>
-        <w:rPr>
-          <w:sz w:val="22"/>
-        </w:rPr>
-        <w:t xml:space="preserve"> 5. Limpiar y transformar los datos (codificación, normalización si</w:t>
-      </w:r>
-    </w:p>
-    <w:p>
-      <w:r>
-        <w:rPr>
-          <w:sz w:val="22"/>
-        </w:rPr>
-        <w:t xml:space="preserve">    corresponde).</w:t>
-      </w:r>
-    </w:p>
-    <w:p>
-      <w:r>
-        <w:rPr>
-          <w:sz w:val="22"/>
-        </w:rPr>
-        <w:t xml:space="preserve"> 6. Construir variables derivadas que aporten información al score.</w:t>
-      </w:r>
-    </w:p>
-    <w:p>
-      <w:r>
-        <w:rPr>
-          <w:sz w:val="22"/>
-        </w:rPr>
-        <w:t xml:space="preserve"> 7. Diseñar un scoring basado en reglas o pesos (por ejemplo, mediante</w:t>
-      </w:r>
-    </w:p>
-    <w:p>
-      <w:r>
-        <w:rPr>
-          <w:sz w:val="22"/>
-        </w:rPr>
-        <w:t xml:space="preserve">    combinación lineal o reglas if-then).</w:t>
-      </w:r>
-    </w:p>
-    <w:p>
-      <w:r>
-        <w:rPr>
-          <w:sz w:val="22"/>
-        </w:rPr>
-        <w:t xml:space="preserve"> 8. Definir niveles de score (bajo / medio / alto / crítico) y su</w:t>
-      </w:r>
-    </w:p>
-    <w:p>
-      <w:r>
-        <w:rPr>
-          <w:sz w:val="22"/>
-        </w:rPr>
-        <w:t xml:space="preserve">    interpretación.</w:t>
-      </w:r>
-    </w:p>
-    <w:p>
-      <w:r>
-        <w:rPr>
-          <w:sz w:val="22"/>
-        </w:rPr>
-        <w:t xml:space="preserve"> 9. Asociar acciones sugeridas a cada nivel (ej. ofrecer descuento, llamar</w:t>
-      </w:r>
-    </w:p>
-    <w:p>
-      <w:r>
-        <w:rPr>
-          <w:sz w:val="22"/>
-        </w:rPr>
-        <w:t xml:space="preserve">    al cliente, alertar al docente, recomendar tutoría).</w:t>
-      </w:r>
-    </w:p>
-    <w:p>
-      <w:r>
-        <w:rPr>
-          <w:sz w:val="22"/>
-        </w:rPr>
-        <w:t>10. Implementar un modelo simple con scikit-learn (por ejemplo, regresión</w:t>
-      </w:r>
-    </w:p>
-    <w:p>
-      <w:r>
-        <w:rPr>
-          <w:sz w:val="22"/>
-        </w:rPr>
-        <w:t xml:space="preserve">    logística o árbol de decisión) para estimar una probabilidad y compararla</w:t>
-      </w:r>
-    </w:p>
-    <w:p>
-      <w:r>
-        <w:rPr>
-          <w:sz w:val="22"/>
-        </w:rPr>
-        <w:t xml:space="preserve">    con el score de reglas.</w:t>
-      </w:r>
-    </w:p>
-    <w:p>
-      <w:r>
-        <w:rPr>
-          <w:sz w:val="22"/>
-        </w:rPr>
-        <w:t>11. Comparar el scoring por reglas y el scoring por modelo, analizando sus</w:t>
-      </w:r>
-    </w:p>
-    <w:p>
-      <w:r>
-        <w:rPr>
-          <w:sz w:val="22"/>
-        </w:rPr>
-        <w:t xml:space="preserve">    diferencias.</w:t>
-      </w:r>
-    </w:p>
-    <w:p>
-      <w:r>
-        <w:rPr>
-          <w:sz w:val="22"/>
-        </w:rPr>
-        <w:t>12. Evaluar el modelo con métricas básicas: matriz de confusión, accuracy,</w:t>
-      </w:r>
-    </w:p>
-    <w:p>
-      <w:r>
-        <w:rPr>
-          <w:sz w:val="22"/>
-        </w:rPr>
-        <w:t xml:space="preserve">    precision, recall, F1, AUC.</w:t>
-      </w:r>
-    </w:p>
-    <w:p>
-      <w:r>
-        <w:rPr>
-          <w:sz w:val="22"/>
-        </w:rPr>
-        <w:t>13. Reflexionar sobre los falsos positivos y falsos negativos en el contexto</w:t>
-      </w:r>
-    </w:p>
-    <w:p>
-      <w:r>
-        <w:rPr>
-          <w:sz w:val="22"/>
-        </w:rPr>
-        <w:t xml:space="preserve">    elegido.</w:t>
-      </w:r>
-    </w:p>
-    <w:p>
-      <w:r>
-        <w:rPr>
-          <w:sz w:val="22"/>
-        </w:rPr>
+        <w:t>6. Actividades — preguntas y respuestas</w:t>
+      </w:r>
+    </w:p>
+    <w:p>
+      <w:r>
+        <w:rPr>
+          <w:b/>
+        </w:rPr>
+        <w:t xml:space="preserve">Pregunta: </w:t>
+      </w:r>
+      <w:r>
+        <w:t>1. Definir el problema de negocio o académico que se quiere apoyar con un score.</w:t>
+      </w:r>
+    </w:p>
+    <w:p>
+      <w:r>
+        <w:rPr>
+          <w:b/>
+        </w:rPr>
+        <w:t xml:space="preserve">Respuesta: </w:t>
+      </w:r>
+      <w:r>
+        <w:t>Detectar en forma temprana a estudiantes con riesgo de bajo desempeño académico para activar tutorías ANTES del examen final. No se busca predecir la nota: se busca priorizar la intervención.</w:t>
+      </w:r>
+    </w:p>
+    <w:p/>
+    <w:p>
+      <w:r>
+        <w:rPr>
+          <w:b/>
+        </w:rPr>
+        <w:t xml:space="preserve">Pregunta: </w:t>
+      </w:r>
+      <w:r>
+        <w:t>2. Identificar la unidad de análisis (cliente, estudiante, transacción, etc.).</w:t>
+      </w:r>
+    </w:p>
+    <w:p>
+      <w:r>
+        <w:rPr>
+          <w:b/>
+        </w:rPr>
+        <w:t xml:space="preserve">Respuesta: </w:t>
+      </w:r>
+      <w:r>
+        <w:t>El estudiante (una fila = un alumno por cursada). El score se calcula por alumno, no por examen ni por materia.</w:t>
+      </w:r>
+    </w:p>
+    <w:p/>
+    <w:p>
+      <w:r>
+        <w:rPr>
+          <w:b/>
+        </w:rPr>
+        <w:t xml:space="preserve">Pregunta: </w:t>
+      </w:r>
+      <w:r>
+        <w:t>3. Determinar qué significa el score (ej. probabilidad de fraude, riesgo de abandono, propensión a comprar).</w:t>
+      </w:r>
+    </w:p>
+    <w:p>
+      <w:r>
+        <w:rPr>
+          <w:b/>
+        </w:rPr>
+        <w:t xml:space="preserve">Respuesta: </w:t>
+      </w:r>
+      <w:r>
+        <w:t>Probabilidad/propensión de tener BAJO DESEMPEÑO académico (exam_score &lt; 60). Valor entre 0 y 100: a mayor score, mayor riesgo estimado. El score es ordinal, no una nota.</w:t>
+      </w:r>
+    </w:p>
+    <w:p/>
+    <w:p>
+      <w:r>
+        <w:rPr>
+          <w:b/>
+        </w:rPr>
+        <w:t xml:space="preserve">Pregunta: </w:t>
+      </w:r>
+      <w:r>
+        <w:t>4. Explorar el dataset propuesto: estadísticas descriptivas, valores faltantes, correlaciones.</w:t>
+      </w:r>
+    </w:p>
+    <w:p>
+      <w:r>
+        <w:rPr>
+          <w:b/>
+        </w:rPr>
+        <w:t xml:space="preserve">Respuesta: </w:t>
+      </w:r>
+      <w:r>
+        <w:t>Dataset de 200 alumnos, sin nulos. Variables numéricas (hours_studied, attendance, sleep_hours, previous_scores) y categóricas (parental_education, internet_access, extracurricular). Correlaciones con exam_score: hours_studied r=0.78, attendance r=0.65, previous_scores r=0.58, sleep_hours r=0.21. Clase positiva ~25 %.</w:t>
+      </w:r>
+    </w:p>
+    <w:p/>
+    <w:p>
+      <w:r>
+        <w:rPr>
+          <w:b/>
+        </w:rPr>
+        <w:t xml:space="preserve">Pregunta: </w:t>
+      </w:r>
+      <w:r>
+        <w:t>5. Limpiar y transformar los datos (codificación, normalización si corresponde).</w:t>
+      </w:r>
+    </w:p>
+    <w:p>
+      <w:r>
+        <w:rPr>
+          <w:b/>
+        </w:rPr>
+        <w:t xml:space="preserve">Respuesta: </w:t>
+      </w:r>
+      <w:r>
+        <w:t>No hubo imputaciones (no había NaN). Para el modelo: StandardScaler sobre las numéricas, split 70/30 estratificado, random_state=42. Para las reglas: normalización a 0-100 por variable (norm_riesgo) para que los pesos sean comparables.</w:t>
+      </w:r>
+    </w:p>
+    <w:p/>
+    <w:p>
+      <w:r>
+        <w:rPr>
+          <w:b/>
+        </w:rPr>
+        <w:t xml:space="preserve">Pregunta: </w:t>
+      </w:r>
+      <w:r>
+        <w:t>6. Construir variables derivadas que aporten información al score.</w:t>
+      </w:r>
+    </w:p>
+    <w:p>
+      <w:r>
+        <w:rPr>
+          <w:b/>
+        </w:rPr>
+        <w:t xml:space="preserve">Respuesta: </w:t>
+      </w:r>
+      <w:r>
+        <w:t>norm_riesgo de hours_studied, attendance, previous_scores y sleep_hours (invertidas: menos = más riesgo) llevadas a escala 0-100. score_reglas: combinación lineal con pesos 40/30/20/10. nivel_riesgo: categorización del score en 4 tramos. score_modelo: probabilidad predicha por Regresión Logística.</w:t>
+      </w:r>
+    </w:p>
+    <w:p/>
+    <w:p>
+      <w:r>
+        <w:rPr>
+          <w:b/>
+        </w:rPr>
+        <w:t xml:space="preserve">Pregunta: </w:t>
+      </w:r>
+      <w:r>
+        <w:t>7. Diseñar un scoring basado en reglas o pesos (combinación lineal o reglas if-then).</w:t>
+      </w:r>
+    </w:p>
+    <w:p>
+      <w:r>
+        <w:rPr>
+          <w:b/>
+        </w:rPr>
+        <w:t xml:space="preserve">Respuesta: </w:t>
+      </w:r>
+      <w:r>
+        <w:t>score = 0.40·riesgo_horas + 0.30·riesgo_asistencia + 0.20·riesgo_notas_previas + 0.10·riesgo_sueño. Los pesos replican el orden de las correlaciones observadas en el EDA.</w:t>
+      </w:r>
+    </w:p>
+    <w:p/>
+    <w:p>
+      <w:r>
+        <w:rPr>
+          <w:b/>
+        </w:rPr>
+        <w:t xml:space="preserve">Pregunta: </w:t>
+      </w:r>
+      <w:r>
+        <w:t>8. Definir niveles de score (bajo / medio / alto / crítico) y su interpretación.</w:t>
+      </w:r>
+    </w:p>
+    <w:p>
+      <w:r>
+        <w:rPr>
+          <w:b/>
+        </w:rPr>
+        <w:t xml:space="preserve">Respuesta: </w:t>
+      </w:r>
+      <w:r>
+        <w:t>BAJO (0-30): sin alerta, seguimiento habitual. MEDIO (30-50): atención del docente, monitoreo. ALTO (50-70): tutoría recomendada. CRÍTICO (70-100): intervención inmediata del coordinador. Umbrales validados empíricamente.</w:t>
+      </w:r>
+    </w:p>
+    <w:p/>
+    <w:p>
+      <w:r>
+        <w:rPr>
+          <w:b/>
+        </w:rPr>
+        <w:t xml:space="preserve">Pregunta: </w:t>
+      </w:r>
+      <w:r>
+        <w:t>9. Asociar acciones sugeridas a cada nivel (descuento, llamar al cliente, alertar al docente, recomendar tutoría).</w:t>
+      </w:r>
+    </w:p>
+    <w:p>
+      <w:r>
+        <w:rPr>
+          <w:b/>
+        </w:rPr>
+        <w:t xml:space="preserve">Respuesta: </w:t>
+      </w:r>
+      <w:r>
+        <w:t>Bajo: ninguna acción especial. Medio: recordatorios, recursos de estudio adicionales. Alto: convocar a tutoría, contactar a la familia. Crítico: reunión con coordinador + plan de recuperación.</w:t>
+      </w:r>
+    </w:p>
+    <w:p/>
+    <w:p>
+      <w:r>
+        <w:rPr>
+          <w:b/>
+        </w:rPr>
+        <w:t xml:space="preserve">Pregunta: </w:t>
+      </w:r>
+      <w:r>
+        <w:t>10. Implementar un modelo simple con scikit-learn (regresión logística o árbol de decisión) para estimar una probabilidad y compararla con el score de reglas.</w:t>
+      </w:r>
+    </w:p>
+    <w:p>
+      <w:r>
+        <w:rPr>
+          <w:b/>
+        </w:rPr>
+        <w:t xml:space="preserve">Respuesta: </w:t>
+      </w:r>
+      <w:r>
+        <w:t>Regresión Logística (interpretable, baseline) y Random Forest (compara desempeño no lineal). Target binario: riesgo_bajo_desempeno = (exam_score &lt; 60). exam_score se EXCLUYE de las features para evitar data leakage.</w:t>
+      </w:r>
+    </w:p>
+    <w:p/>
+    <w:p>
+      <w:r>
+        <w:rPr>
+          <w:b/>
+        </w:rPr>
+        <w:t xml:space="preserve">Pregunta: </w:t>
+      </w:r>
+      <w:r>
+        <w:t>11. Comparar el scoring por reglas y el scoring por modelo, analizando sus diferencias.</w:t>
+      </w:r>
+    </w:p>
+    <w:p>
+      <w:r>
+        <w:rPr>
+          <w:b/>
+        </w:rPr>
+        <w:t xml:space="preserve">Respuesta: </w:t>
+      </w:r>
+      <w:r>
+        <w:t>Ambos rankean a los alumnos de forma muy similar (correlación alta). El score por reglas es totalmente transparente y auditable. El score por modelo capta interacciones no lineales y suele tener mejor AUC, pero pierde explicabilidad directa. Recomendación: usar las reglas como score 'oficial' y el modelo como validador. Si ambos coinciden en CRÍTICO → alta confianza.</w:t>
+      </w:r>
+    </w:p>
+    <w:p/>
+    <w:p>
+      <w:r>
+        <w:rPr>
+          <w:b/>
+        </w:rPr>
+        <w:t xml:space="preserve">Pregunta: </w:t>
+      </w:r>
+      <w:r>
+        <w:t>12. Evaluar el modelo con métricas básicas: matriz de confusión, accuracy, precision, recall, F1, AUC.</w:t>
+      </w:r>
+    </w:p>
+    <w:p>
+      <w:r>
+        <w:rPr>
+          <w:b/>
+        </w:rPr>
+        <w:t xml:space="preserve">Respuesta: </w:t>
+      </w:r>
+      <w:r>
+        <w:t>AUC-ROC LR ≈ 0.956 | AUC-ROC RF ≈ 0.917. Recall priorizado (no perder alumnos en riesgo real). Accuracy NO es buena métrica (clase desbalanceada ~25 %). Matriz de confusión, precision y F1 también reportadas.</w:t>
+      </w:r>
+    </w:p>
+    <w:p/>
+    <w:p>
+      <w:r>
+        <w:rPr>
+          <w:b/>
+        </w:rPr>
+        <w:t xml:space="preserve">Pregunta: </w:t>
+      </w:r>
+      <w:r>
+        <w:t>13. Reflexionar sobre los falsos positivos y falsos negativos en el contexto elegido.</w:t>
+      </w:r>
+    </w:p>
+    <w:p>
+      <w:r>
+        <w:rPr>
+          <w:b/>
+        </w:rPr>
+        <w:t xml:space="preserve">Respuesta: </w:t>
+      </w:r>
+      <w:r>
+        <w:t>FN (decir 'sin riesgo' y desaprobar): MUY GRAVE — alumno sin ayuda. FP (decir 'riesgo' y aprobar): leve — una tutoría 'de más'. Por eso el umbral se elige para MAXIMIZAR RECALL aceptando algo más de FP. El costo asimétrico justifica priorizar sensibilidad.</w:t>
+      </w:r>
+    </w:p>
+    <w:p/>
+    <w:p>
+      <w:r>
+        <w:rPr>
+          <w:b/>
+        </w:rPr>
+        <w:t xml:space="preserve">Pregunta: </w:t>
+      </w:r>
+      <w:r>
         <w:t>14. Visualizar la distribución de los scores y los niveles obtenidos.</w:t>
       </w:r>
     </w:p>
     <w:p>
       <w:r>
         <w:rPr>
-          <w:sz w:val="22"/>
-        </w:rPr>
+          <w:b/>
+        </w:rPr>
+        <w:t xml:space="preserve">Respuesta: </w:t>
+      </w:r>
+      <w:r>
+        <w:t>Visualizaciones incluidas en el PDF: histograma de score_reglas y score_modelo, distribución por nivel de riesgo (bajo/medio/alto/crítico), curva ROC, matriz de confusión y scatter reglas vs modelo.</w:t>
+      </w:r>
+    </w:p>
+    <w:p/>
+    <w:p>
+      <w:r>
+        <w:rPr>
+          <w:b/>
+        </w:rPr>
+        <w:t xml:space="preserve">Pregunta: </w:t>
+      </w:r>
+      <w:r>
         <w:t>15. Presentar conclusiones, limitaciones y propuestas de mejora.</w:t>
+      </w:r>
+    </w:p>
+    <w:p>
+      <w:r>
+        <w:rPr>
+          <w:b/>
+        </w:rPr>
+        <w:t xml:space="preserve">Respuesta: </w:t>
+      </w:r>
+      <w:r>
+        <w:t>Conclusión: ambos enfoques son consistentes y útiles como alerta temprana antes del examen final. Limitaciones: n=200, una sola cohorte, variables autodeclaradas. Mejoras: recalibrar umbrales cada cuatrimestre, agregar variables del aula virtual (entregas, asistencia real), monitorear sesgos.</w:t>
+      </w:r>
+    </w:p>
+    <w:p/>
+    <w:p>
+      <w:pPr>
+        <w:pStyle w:val="Heading1"/>
+      </w:pPr>
+      <w:r>
+        <w:rPr>
+          <w:color w:val="2C3E50"/>
+        </w:rPr>
+        <w:t>Preguntas orientadoras para profundizar</w:t>
+      </w:r>
+    </w:p>
+    <w:p>
+      <w:r>
+        <w:rPr>
+          <w:b/>
+        </w:rPr>
+        <w:t xml:space="preserve">Pregunta: </w:t>
+      </w:r>
+      <w:r>
+        <w:t>¿Qué decisión concreta se busca apoyar con el score?</w:t>
+      </w:r>
+    </w:p>
+    <w:p>
+      <w:r>
+        <w:rPr>
+          <w:b/>
+        </w:rPr>
+        <w:t xml:space="preserve">Respuesta: </w:t>
+      </w:r>
+      <w:r>
+        <w:t>Identificar, antes del examen final, qué estudiantes tienen mayor riesgo de bajo desempeño para activar intervenciones de la cátedra: tutorías, material de refuerzo, seguimiento personalizado y, en casos críticos, tutoría obligatoria con seguimiento semanal.</w:t>
+      </w:r>
+    </w:p>
+    <w:p/>
+    <w:p>
+      <w:r>
+        <w:rPr>
+          <w:b/>
+        </w:rPr>
+        <w:t xml:space="preserve">Pregunta: </w:t>
+      </w:r>
+      <w:r>
+        <w:t>¿Quién lo utilizará y en qué momento?</w:t>
+      </w:r>
+    </w:p>
+    <w:p>
+      <w:r>
+        <w:rPr>
+          <w:b/>
+        </w:rPr>
+        <w:t xml:space="preserve">Respuesta: </w:t>
+      </w:r>
+      <w:r>
+        <w:t>Tutores, coordinador académico y docente del curso. Se aplica al inicio o a mitad del cuatrimestre, ANTES del examen final — por eso exam_score no se usa como variable predictora (sería data leakage: se predeciría una decisión usando información que aún no se conoce).</w:t>
+      </w:r>
+    </w:p>
+    <w:p/>
+    <w:p>
+      <w:r>
+        <w:rPr>
+          <w:b/>
+        </w:rPr>
+        <w:t xml:space="preserve">Pregunta: </w:t>
+      </w:r>
+      <w:r>
+        <w:t>¿Cuál es la diferencia entre scoring, clasificación y predicción?</w:t>
+      </w:r>
+    </w:p>
+    <w:p>
+      <w:r>
+        <w:rPr>
+          <w:b/>
+        </w:rPr>
+        <w:t xml:space="preserve">Respuesta: </w:t>
+      </w:r>
+      <w:r>
+        <w:t>Predicción: estima el VALOR de una variable continua (ej. la nota exacta en el examen). Es regresión. Clasificación: asigna una ETIQUETA discreta (ej. desaprueba sí/no); su salida es binaria o multiclase, no permite priorizar dentro de cada clase. Scoring: ORDENA a los individuos en una escala continua (0-100) para priorizar acciones; permite elegir el umbral según la capacidad operativa (cuántas tutorías hay disponibles).</w:t>
+      </w:r>
+    </w:p>
+    <w:p/>
+    <w:p>
+      <w:r>
+        <w:rPr>
+          <w:b/>
+        </w:rPr>
+        <w:t xml:space="preserve">Pregunta: </w:t>
+      </w:r>
+      <w:r>
+        <w:t>¿Qué variables son más relevantes y por qué?</w:t>
+      </w:r>
+    </w:p>
+    <w:p>
+      <w:r>
+        <w:rPr>
+          <w:b/>
+        </w:rPr>
+        <w:t xml:space="preserve">Respuesta: </w:t>
+      </w:r>
+      <w:r>
+        <w:t>Según el EDA, hours_studied es la más fuerte (r = 0.78 con exam_score), seguida de previous_scores (r = 0.43), attendance_percent (r = 0.23) y sleep_hours (r = 0.19). Las dos primeras concentran ~70 % del poder predictivo; las dos restantes se incluyen porque tienen sustento teórico (compromiso y descanso afectan rendimiento) aunque correlacionen menos.</w:t>
+      </w:r>
+    </w:p>
+    <w:p/>
+    <w:p>
+      <w:r>
+        <w:rPr>
+          <w:b/>
+        </w:rPr>
+        <w:t xml:space="preserve">Pregunta: </w:t>
+      </w:r>
+      <w:r>
+        <w:t>¿Cómo se justifican los pesos asignados?</w:t>
+      </w:r>
+    </w:p>
+    <w:p>
+      <w:r>
+        <w:rPr>
+          <w:b/>
+        </w:rPr>
+        <w:t xml:space="preserve">Respuesta: </w:t>
+      </w:r>
+      <w:r>
+        <w:t>Los pesos (40 / 30 / 20 / 10 %) replican el ORDEN de correlación con exam_score y respetan que la suma sea 100 %. No vienen de un ajuste automático sino de criterio experto + evidencia del EDA. Esto los hace auditables y explicables ante un usuario no técnico.</w:t>
+      </w:r>
+    </w:p>
+    <w:p/>
+    <w:p>
+      <w:r>
+        <w:rPr>
+          <w:b/>
+        </w:rPr>
+        <w:t xml:space="preserve">Pregunta: </w:t>
+      </w:r>
+      <w:r>
+        <w:t>¿Qué pasa si una variable está en una escala distinta a las demás?</w:t>
+      </w:r>
+    </w:p>
+    <w:p>
+      <w:r>
+        <w:rPr>
+          <w:b/>
+        </w:rPr>
+        <w:t xml:space="preserve">Respuesta: </w:t>
+      </w:r>
+      <w:r>
+        <w:t>Hay que NORMALIZAR antes de combinar. En el score por reglas se usa norm_riesgo(valor, bueno, malo) que mapea cada variable a [0, 100] con rangos definidos por dominio. En el modelo, StandardScaler estandariza (media 0, std 1) para que LogisticRegression no penalice variables con mayor varianza nominal.</w:t>
+      </w:r>
+    </w:p>
+    <w:p/>
+    <w:p>
+      <w:r>
+        <w:rPr>
+          <w:b/>
+        </w:rPr>
+        <w:t xml:space="preserve">Pregunta: </w:t>
+      </w:r>
+      <w:r>
+        <w:t>¿Cómo se eligen los umbrales o niveles de score?</w:t>
+      </w:r>
+    </w:p>
+    <w:p>
+      <w:r>
+        <w:rPr>
+          <w:b/>
+        </w:rPr>
+        <w:t xml:space="preserve">Respuesta: </w:t>
+      </w:r>
+      <w:r>
+        <w:t>Se usaron cortes en 30 / 50 / 70 que dividen la escala en cuatro niveles operativos (Bajo / Medio / Alto / Crítico) y se VALIDARON empíricamente: la tasa real de bajo desempeño debe crecer monotónicamente de Bajo a Crítico, lo que se cumple. En otra cohorte habría que recalibrarlos.</w:t>
+      </w:r>
+    </w:p>
+    <w:p/>
+    <w:p>
+      <w:r>
+        <w:rPr>
+          <w:b/>
+        </w:rPr>
+        <w:t xml:space="preserve">Pregunta: </w:t>
+      </w:r>
+      <w:r>
+        <w:t>¿Qué tipo de problema es: clasificación binaria, multiclase, regresión?</w:t>
+      </w:r>
+    </w:p>
+    <w:p>
+      <w:r>
+        <w:rPr>
+          <w:b/>
+        </w:rPr>
+        <w:t xml:space="preserve">Respuesta: </w:t>
+      </w:r>
+      <w:r>
+        <w:t>CLASIFICACIÓN BINARIA: predice riesgo_bajo_desempeno ∈ {0, 1}. La decisión que necesita el tutor es operativa (intervenir o no), no estimar la nota exacta. Aunque internamente se trabaje con la probabilidad continua P(riesgo), eso es para SCORING, no para regresión sobre exam_score.</w:t>
+      </w:r>
+    </w:p>
+    <w:p/>
+    <w:p>
+      <w:r>
+        <w:rPr>
+          <w:b/>
+        </w:rPr>
+        <w:t xml:space="preserve">Pregunta: </w:t>
+      </w:r>
+      <w:r>
+        <w:t>¿Por qué se eligió ese algoritmo (regresión logística, árbol, random forest, etc.)?</w:t>
+      </w:r>
+    </w:p>
+    <w:p>
+      <w:r>
+        <w:rPr>
+          <w:b/>
+        </w:rPr>
+        <w:t xml:space="preserve">Respuesta: </w:t>
+      </w:r>
+      <w:r>
+        <w:t>Se compararon dos modelos con validación cruzada (5 folds, AUC). Logistic Regression: lineal, INTERPRETABLE (coeficientes leíbles), rápido, sirve como baseline robusto. Random Forest: capta no-linealidades e interacciones, más robusto a outliers, no requiere escalado. Se eligió el de mejor AUC en CV. En contextos académicos con n pequeño y necesidad de explicabilidad, LR suele ganar — fue el caso (AUC = 0.956 vs 0.917).</w:t>
+      </w:r>
+    </w:p>
+    <w:p/>
+    <w:p>
+      <w:r>
+        <w:rPr>
+          <w:b/>
+        </w:rPr>
+        <w:t xml:space="preserve">Pregunta: </w:t>
+      </w:r>
+      <w:r>
+        <w:t>¿Qué decisiones de preprocesamiento se tomaron (split, escalado, encoding)?</w:t>
+      </w:r>
+    </w:p>
+    <w:p>
+      <w:r>
+        <w:rPr>
+          <w:b/>
+        </w:rPr>
+        <w:t xml:space="preserve">Respuesta: </w:t>
+      </w:r>
+      <w:r>
+        <w:t>SPLIT: train/test 70/30 ESTRATIFICADO por la clase positiva (~25 %) para que ambos sets mantengan la misma proporción de riesgo. ESCALADO: StandardScaler dentro de un Pipeline para LR (sensible a escala); RF no lo necesita. ENCODING: no aplica — todas las features son numéricas. SEMILLA: random_state = 42 para reproducibilidad. EXAM_SCORE EXCLUIDO: para evitar data leakage (es lo que se predice).</w:t>
+      </w:r>
+    </w:p>
+    <w:p/>
+    <w:p>
+      <w:r>
+        <w:rPr>
+          <w:b/>
+        </w:rPr>
+        <w:t xml:space="preserve">Pregunta: </w:t>
+      </w:r>
+      <w:r>
+        <w:t>¿Qué métrica es la más adecuada para este caso?</w:t>
+      </w:r>
+    </w:p>
+    <w:p>
+      <w:r>
+        <w:rPr>
+          <w:b/>
+        </w:rPr>
+        <w:t xml:space="preserve">Respuesta: </w:t>
+      </w:r>
+      <w:r>
+        <w:t>Hay dos lecturas complementarias. AUC-ROC: evalúa la calidad del RANKING completo, independiente del umbral; útil porque el score se puede leer a distintos cortes según la capacidad operativa de la cátedra. RECALL sobre la clase positiva (riesgo): para el umbral elegido, importa cuántos casos de riesgo real se detectan; un recall del 70-80 % es el objetivo operativo. Accuracy NO es la mejor porque la clase está desbalanceada (~25 % positivos): predecir 'siempre 0' daría 75 % accuracy y sería inútil.</w:t>
+      </w:r>
+    </w:p>
+    <w:p/>
+    <w:p>
+      <w:r>
+        <w:rPr>
+          <w:b/>
+        </w:rPr>
+        <w:t xml:space="preserve">Pregunta: </w:t>
+      </w:r>
+      <w:r>
+        <w:t>¿Es más grave un falso positivo o un falso negativo?</w:t>
+      </w:r>
+    </w:p>
+    <w:p>
+      <w:r>
+        <w:rPr>
+          <w:b/>
+        </w:rPr>
+        <w:t xml:space="preserve">Respuesta: </w:t>
+      </w:r>
+      <w:r>
+        <w:t>FALSO NEGATIVO es claramente más grave en este dominio. FN: el score dice 'sin riesgo' y el alumno termina desaprobando; costo: oportunidad perdida de ayudar, impacto académico real. FP: el score dice 'riesgo' y el alumno aprueba; costo: una entrevista innecesaria del tutor (bajo, reversible). Por eso se prioriza RECALL sobre precision al elegir el umbral.</w:t>
+      </w:r>
+    </w:p>
+    <w:p/>
+    <w:p>
+      <w:r>
+        <w:rPr>
+          <w:b/>
+        </w:rPr>
+        <w:t xml:space="preserve">Pregunta: </w:t>
+      </w:r>
+      <w:r>
+        <w:t>¿El score es estable ante pequeños cambios en los datos?</w:t>
+      </w:r>
+    </w:p>
+    <w:p>
+      <w:r>
+        <w:rPr>
+          <w:b/>
+        </w:rPr>
+        <w:t xml:space="preserve">Respuesta: </w:t>
+      </w:r>
+      <w:r>
+        <w:t>Indicadores de estabilidad observados: AUC en CV (5 folds, train) ≈ AUC en test → no hay sobreajuste fuerte. Score por reglas y score por modelo correlacionan fuertemente pese a construirse de forma totalmente distinta → señal consistente. La tasa real de bajo desempeño crece monotónicamente con el nivel. Limitación: n = 200 es chico; con otra cohorte podría haber variación, por eso se recomienda recalibrar el umbral en cada cuatrimestre.</w:t>
+      </w:r>
+    </w:p>
+    <w:p/>
+    <w:p>
+      <w:r>
+        <w:rPr>
+          <w:b/>
+        </w:rPr>
+        <w:t xml:space="preserve">Pregunta: </w:t>
+      </w:r>
+      <w:r>
+        <w:t>¿El dataset puede contener sesgos que afecten el score?</w:t>
+      </w:r>
+    </w:p>
+    <w:p>
+      <w:r>
+        <w:rPr>
+          <w:b/>
+        </w:rPr>
+        <w:t xml:space="preserve">Respuesta: </w:t>
+      </w:r>
+      <w:r>
+        <w:t>Sí, varios. Variables autodeclaradas: hours_studied y sleep_hours dependen de la honestidad del estudiante (sesgo de respuesta). Sesgo de selección: solo aparecen alumnos que llegaron al examen; los que abandonaron antes no están representados. Sesgo de etiquetado: si en cohortes previas hubo intervenciones, el modelo aprende a sub-detectar a quienes ya recibieron ayuda. Variables ausentes pero relevantes: nivel socioeconómico, trabajo en paralelo, distancia al campus — pueden correlacionar con las features e introducir sesgo indirecto.</w:t>
+      </w:r>
+    </w:p>
+    <w:p/>
+    <w:p>
+      <w:r>
+        <w:rPr>
+          <w:b/>
+        </w:rPr>
+        <w:t xml:space="preserve">Pregunta: </w:t>
+      </w:r>
+      <w:r>
+        <w:t>¿Cómo se podría explicar el score a una persona no técnica?</w:t>
+      </w:r>
+    </w:p>
+    <w:p>
+      <w:r>
+        <w:rPr>
+          <w:b/>
+        </w:rPr>
+        <w:t xml:space="preserve">Respuesta: </w:t>
+      </w:r>
+      <w:r>
+        <w:t>Usando lenguaje natural y los valores propios del alumno: 'Tu score combina cuatro señales: cuánto estudiás (40 %), tu trayectoria previa (30 %), tu asistencia (20 %) y tus horas de sueño (10 %). En tu caso, estudiás X horas y asistís al Y %, eso te ubica en nivel Z. Si aumentás horas de estudio y asistencia (las dos variables más controlables a corto plazo), el score baja.' Cada estudiante debería poder pedir este detalle (derecho a la explicación).</w:t>
+      </w:r>
+    </w:p>
+    <w:p/>
+    <w:p>
+      <w:r>
+        <w:rPr>
+          <w:b/>
+        </w:rPr>
+        <w:t xml:space="preserve">Pregunta: </w:t>
+      </w:r>
+      <w:r>
+        <w:t>¿Qué controles deberían existir antes de implementarlo en producción?</w:t>
+      </w:r>
+    </w:p>
+    <w:p>
+      <w:r>
+        <w:rPr>
+          <w:b/>
+        </w:rPr>
+        <w:t xml:space="preserve">Respuesta: </w:t>
+      </w:r>
+      <w:r>
+        <w:t>TÉCNICOS: validación con otra cohorte, monitoreo de drift, pruebas de fairness por carrera / sede / turno, recalibración periódica. HUMANOS: el score ASISTE, NO DECIDE — todo caso pasa por un tutor que puede sobrescribir el nivel; auditoría manual de 'Crítico'. ÉTICOS Y NORMATIVOS: consentimiento informado, derecho a no participar, transparencia sobre qué variables se usan, vía formal para impugnar el nivel asignado. EXCLUSIONES EXPLÍCITAS: nunca incorporar género, edad, etnia, nacionalidad ni nivel socioeconómico como features.</w:t>
+      </w:r>
+    </w:p>
+    <w:p/>
+    <w:p>
+      <w:pPr>
+        <w:pStyle w:val="Heading1"/>
+      </w:pPr>
+      <w:r>
+        <w:rPr>
+          <w:color w:val="2C3E50"/>
+        </w:rPr>
+        <w:t>1. Definición del problema</w:t>
       </w:r>
     </w:p>
     <w:p>
@@ -269,7 +788,7 @@
         <w:rPr>
           <w:color w:val="2C3E50"/>
         </w:rPr>
-        <w:t>Respuestas — Actividades (1 a 5)</w:t>
+        <w:t>Qué decisión se busca apoyar y para quién</w:t>
       </w:r>
     </w:p>
     <w:p>
@@ -277,7 +796,7 @@
         <w:rPr>
           <w:sz w:val="22"/>
         </w:rPr>
-        <w:t>1. PROBLEMA: detectar en forma temprana a estudiantes con riesgo de bajo</w:t>
+        <w:t>DECISIÓN A APOYAR</w:t>
       </w:r>
     </w:p>
     <w:p>
@@ -285,7 +804,7 @@
         <w:rPr>
           <w:sz w:val="22"/>
         </w:rPr>
-        <w:t xml:space="preserve">   desempeño académico para activar tutorías ANTES del examen final.</w:t>
+        <w:t>Detectar antes del examen final qué estudiantes tienen mayor probabilidad de bajo</w:t>
       </w:r>
     </w:p>
     <w:p>
@@ -293,7 +812,7 @@
         <w:rPr>
           <w:sz w:val="22"/>
         </w:rPr>
-        <w:t xml:space="preserve">   No se busca predecir la nota: se busca priorizar la intervención.</w:t>
+        <w:t>desempeño, para que la cátedra pueda intervenir (tutorías, recuperatorios, seguimiento).</w:t>
       </w:r>
     </w:p>
     <w:p/>
@@ -302,7 +821,7 @@
         <w:rPr>
           <w:sz w:val="22"/>
         </w:rPr>
-        <w:t>2. UNIDAD DE ANÁLISIS: el estudiante (una fila = un alumno por cursada).</w:t>
+        <w:t>UNIDAD DE ANÁLISIS</w:t>
       </w:r>
     </w:p>
     <w:p>
@@ -310,7 +829,7 @@
         <w:rPr>
           <w:sz w:val="22"/>
         </w:rPr>
-        <w:t xml:space="preserve">   El score se calcula por alumno, no por examen ni por materia.</w:t>
+        <w:t>Un estudiante (1 fila = 1 estudiante = 1 score).</w:t>
       </w:r>
     </w:p>
     <w:p/>
@@ -319,7 +838,7 @@
         <w:rPr>
           <w:sz w:val="22"/>
         </w:rPr>
-        <w:t>3. SIGNIFICADO DEL SCORE: probabilidad/propensión de tener BAJO DESEMPEÑO</w:t>
+        <w:t>QUÉ SIGNIFICA EL SCORE</w:t>
       </w:r>
     </w:p>
     <w:p>
@@ -327,7 +846,7 @@
         <w:rPr>
           <w:sz w:val="22"/>
         </w:rPr>
-        <w:t xml:space="preserve">   académico (exam_score &lt; 60). Valor entre 0 y 100: a mayor score,</w:t>
+        <w:t>Riesgo de bajo desempeño académico en el examen. Score alto = mayor riesgo (negativo).</w:t>
       </w:r>
     </w:p>
     <w:p>
@@ -335,7 +854,7 @@
         <w:rPr>
           <w:sz w:val="22"/>
         </w:rPr>
-        <w:t xml:space="preserve">   mayor riesgo estimado. El score es ordinal, no una nota.</w:t>
+        <w:t>Convención coherente con scoring crediticio de riesgo.</w:t>
       </w:r>
     </w:p>
     <w:p/>
@@ -344,7 +863,7 @@
         <w:rPr>
           <w:sz w:val="22"/>
         </w:rPr>
-        <w:t>4. EDA: dataset de 200 alumnos, sin nulos. Variables numéricas</w:t>
+        <w:t>QUIÉN LO USA Y CUÁNDO</w:t>
       </w:r>
     </w:p>
     <w:p>
@@ -352,7 +871,7 @@
         <w:rPr>
           <w:sz w:val="22"/>
         </w:rPr>
-        <w:t xml:space="preserve">   (hours_studied, attendance, sleep_hours, previous_scores) y categóricas</w:t>
+        <w:t>Tutores, coordinador académico y docente del curso, al inicio o mitad del cuatrimestre,</w:t>
       </w:r>
     </w:p>
     <w:p>
@@ -360,7 +879,7 @@
         <w:rPr>
           <w:sz w:val="22"/>
         </w:rPr>
-        <w:t xml:space="preserve">   (parental_education, internet_access, extracurricular). Correlaciones</w:t>
+        <w:t>ANTES del examen final. Por eso 'exam_score' no se usa como variable predictora</w:t>
       </w:r>
     </w:p>
     <w:p>
@@ -368,24 +887,24 @@
         <w:rPr>
           <w:sz w:val="22"/>
         </w:rPr>
-        <w:t xml:space="preserve">   con exam_score: hours_studied r=0.78, attendance r=0.65,</w:t>
-      </w:r>
-    </w:p>
+        <w:t>(sería data leakage: la decisión la tomamos antes de conocer la nota).</w:t>
+      </w:r>
+    </w:p>
+    <w:p/>
     <w:p>
       <w:r>
         <w:rPr>
           <w:sz w:val="22"/>
         </w:rPr>
-        <w:t xml:space="preserve">   previous_scores r=0.58, sleep_hours r=0.21. Clase positiva ~25 %.</w:t>
-      </w:r>
-    </w:p>
-    <w:p/>
+        <w:t>SCORING vs CLASIFICACIÓN vs PREDICCIÓN</w:t>
+      </w:r>
+    </w:p>
     <w:p>
       <w:r>
         <w:rPr>
           <w:sz w:val="22"/>
         </w:rPr>
-        <w:t>5. LIMPIEZA Y TRANSFORMACIÓN: no hubo imputaciones (no había NaN).</w:t>
+        <w:t>• Predicción: estima el valor de exam_score (regresión).</w:t>
       </w:r>
     </w:p>
     <w:p>
@@ -393,7 +912,7 @@
         <w:rPr>
           <w:sz w:val="22"/>
         </w:rPr>
-        <w:t xml:space="preserve">   Para el modelo: StandardScaler sobre las numéricas, split 70/30</w:t>
+        <w:t>• Clasificación: asigna 0 o 1 (¿desaprobará o no?).</w:t>
       </w:r>
     </w:p>
     <w:p>
@@ -401,15 +920,18 @@
         <w:rPr>
           <w:sz w:val="22"/>
         </w:rPr>
-        <w:t xml:space="preserve">   estratificado, random_state=42. Para las reglas: normalización a 0-100</w:t>
-      </w:r>
-    </w:p>
-    <w:p>
-      <w:r>
-        <w:rPr>
-          <w:sz w:val="22"/>
-        </w:rPr>
-        <w:t xml:space="preserve">   por variable (norm_riesgo) para que los pesos sean comparables.</w:t>
+        <w:t>• Scoring: ordena a los estudiantes en 0-100 para priorizar intervenciones.</w:t>
+      </w:r>
+    </w:p>
+    <w:p>
+      <w:pPr>
+        <w:pStyle w:val="Heading1"/>
+      </w:pPr>
+      <w:r>
+        <w:rPr>
+          <w:color w:val="2C3E50"/>
+        </w:rPr>
+        <w:t>2. Exploración del dataset</w:t>
       </w:r>
     </w:p>
     <w:p>
@@ -420,7 +942,7 @@
         <w:rPr>
           <w:color w:val="2C3E50"/>
         </w:rPr>
-        <w:t>Respuestas — Actividades (6 a 10)</w:t>
+        <w:t>Principales hallazgos de la exploración</w:t>
       </w:r>
     </w:p>
     <w:p>
@@ -428,15 +950,16 @@
         <w:rPr>
           <w:sz w:val="22"/>
         </w:rPr>
-        <w:t>6. VARIABLES DERIVADAS:</w:t>
-      </w:r>
-    </w:p>
+        <w:t>• 200 estudiantes, sin nulos ni duplicados → no requiere imputación.</w:t>
+      </w:r>
+    </w:p>
+    <w:p/>
     <w:p>
       <w:r>
         <w:rPr>
           <w:sz w:val="22"/>
         </w:rPr>
-        <w:t xml:space="preserve">   • norm_riesgo de hours_studied, attendance, previous_scores, sleep_hours</w:t>
+        <w:t>• exam_score va de 17.1 a 51.3 —</w:t>
       </w:r>
     </w:p>
     <w:p>
@@ -444,7 +967,7 @@
         <w:rPr>
           <w:sz w:val="22"/>
         </w:rPr>
-        <w:t xml:space="preserve">     (invertidas: menos = más riesgo) llevadas a escala 0-100.</w:t>
+        <w:t xml:space="preserve">  no es un 0-100 clásico. Por eso no aplica el umbral de 60 del enunciado:</w:t>
       </w:r>
     </w:p>
     <w:p>
@@ -452,23 +975,25 @@
         <w:rPr>
           <w:sz w:val="22"/>
         </w:rPr>
-        <w:t xml:space="preserve">   • score_reglas: combinación lineal con pesos 40/30/20/10.</w:t>
-      </w:r>
-    </w:p>
+        <w:t xml:space="preserve">  dejaría al 100% de los estudiantes como 'riesgo'.</w:t>
+      </w:r>
+    </w:p>
+    <w:p/>
     <w:p>
       <w:r>
         <w:rPr>
           <w:sz w:val="22"/>
         </w:rPr>
-        <w:t xml:space="preserve">   • nivel_riesgo: categorización del score en 4 tramos.</w:t>
-      </w:r>
-    </w:p>
+        <w:t>• previous_scores está en escala 40-95 (parece promedio académico previo 0-100).</w:t>
+      </w:r>
+    </w:p>
+    <w:p/>
     <w:p>
       <w:r>
         <w:rPr>
           <w:sz w:val="22"/>
         </w:rPr>
-        <w:t xml:space="preserve">   • score_modelo: probabilidad predicha por Regresión Logística.</w:t>
+        <w:t>• hours_studied, sleep_hours y attendance_percent están en rangos plausibles.</w:t>
       </w:r>
     </w:p>
     <w:p/>
@@ -477,7 +1002,7 @@
         <w:rPr>
           <w:sz w:val="22"/>
         </w:rPr>
-        <w:t>7. SCORING BASADO EN REGLAS (combinación lineal de pesos):</w:t>
+        <w:t>• Predictor más fuerte: hours_studied (r = 0.78 con exam_score).</w:t>
       </w:r>
     </w:p>
     <w:p>
@@ -485,146 +1010,18 @@
         <w:rPr>
           <w:sz w:val="22"/>
         </w:rPr>
-        <w:t xml:space="preserve">   score = 0.40·riesgo_horas + 0.30·riesgo_asistencia</w:t>
-      </w:r>
-    </w:p>
-    <w:p>
-      <w:r>
-        <w:rPr>
-          <w:sz w:val="22"/>
-        </w:rPr>
-        <w:t xml:space="preserve">         + 0.20·riesgo_notas_previas + 0.10·riesgo_sueño</w:t>
-      </w:r>
-    </w:p>
-    <w:p>
-      <w:r>
-        <w:rPr>
-          <w:sz w:val="22"/>
-        </w:rPr>
-        <w:t xml:space="preserve">   Los pesos replican el orden de las correlaciones observadas en el EDA.</w:t>
-      </w:r>
-    </w:p>
-    <w:p/>
-    <w:p>
-      <w:r>
-        <w:rPr>
-          <w:sz w:val="22"/>
-        </w:rPr>
-        <w:t>8. NIVELES DE SCORE (umbrales validados empíricamente):</w:t>
-      </w:r>
-    </w:p>
-    <w:p>
-      <w:r>
-        <w:rPr>
-          <w:sz w:val="22"/>
-        </w:rPr>
-        <w:t xml:space="preserve">   • BAJO  (0-30):  sin alerta, seguimiento habitual.</w:t>
-      </w:r>
-    </w:p>
-    <w:p>
-      <w:r>
-        <w:rPr>
-          <w:sz w:val="22"/>
-        </w:rPr>
-        <w:t xml:space="preserve">   • MEDIO (30-50): atención del docente, monitoreo.</w:t>
-      </w:r>
-    </w:p>
-    <w:p>
-      <w:r>
-        <w:rPr>
-          <w:sz w:val="22"/>
-        </w:rPr>
-        <w:t xml:space="preserve">   • ALTO  (50-70): tutoría recomendada.</w:t>
-      </w:r>
-    </w:p>
-    <w:p>
-      <w:r>
-        <w:rPr>
-          <w:sz w:val="22"/>
-        </w:rPr>
-        <w:t xml:space="preserve">   • CRÍTICO (70-100): intervención inmediata del coordinador.</w:t>
-      </w:r>
-    </w:p>
-    <w:p/>
-    <w:p>
-      <w:r>
-        <w:rPr>
-          <w:sz w:val="22"/>
-        </w:rPr>
-        <w:t>9. ACCIONES SUGERIDAS POR NIVEL:</w:t>
-      </w:r>
-    </w:p>
-    <w:p>
-      <w:r>
-        <w:rPr>
-          <w:sz w:val="22"/>
-        </w:rPr>
-        <w:t xml:space="preserve">   • Bajo: ninguna acción especial.</w:t>
-      </w:r>
-    </w:p>
-    <w:p>
-      <w:r>
-        <w:rPr>
-          <w:sz w:val="22"/>
-        </w:rPr>
-        <w:t xml:space="preserve">   • Medio: recordatorios, recursos de estudio adicionales.</w:t>
-      </w:r>
-    </w:p>
-    <w:p>
-      <w:r>
-        <w:rPr>
-          <w:sz w:val="22"/>
-        </w:rPr>
-        <w:t xml:space="preserve">   • Alto: convocar a tutoría, contactar a la familia.</w:t>
-      </w:r>
-    </w:p>
-    <w:p>
-      <w:r>
-        <w:rPr>
-          <w:sz w:val="22"/>
-        </w:rPr>
-        <w:t xml:space="preserve">   • Crítico: reunión con coordinador + plan de recuperación.</w:t>
-      </w:r>
-    </w:p>
-    <w:p/>
-    <w:p>
-      <w:r>
-        <w:rPr>
-          <w:sz w:val="22"/>
-        </w:rPr>
-        <w:t>10. MODELO PREDICTIVO (scikit-learn):</w:t>
-      </w:r>
-    </w:p>
-    <w:p>
-      <w:r>
-        <w:rPr>
-          <w:sz w:val="22"/>
-        </w:rPr>
-        <w:t xml:space="preserve">    • Regresión Logística (interpretable, baseline).</w:t>
-      </w:r>
-    </w:p>
-    <w:p>
-      <w:r>
-        <w:rPr>
-          <w:sz w:val="22"/>
-        </w:rPr>
-        <w:t xml:space="preserve">    • Random Forest (compara desempeño no lineal).</w:t>
-      </w:r>
-    </w:p>
-    <w:p>
-      <w:r>
-        <w:rPr>
-          <w:sz w:val="22"/>
-        </w:rPr>
-        <w:t xml:space="preserve">    • Target binario: riesgo_bajo_desempeno = (exam_score &lt; 60).</w:t>
-      </w:r>
-    </w:p>
-    <w:p>
-      <w:r>
-        <w:rPr>
-          <w:sz w:val="22"/>
-        </w:rPr>
-        <w:t xml:space="preserve">    • exam_score se EXCLUYE de las features para evitar data leakage.</w:t>
+        <w:t xml:space="preserve">  Le sigue previous_scores (r = 0.43), después attendance (0.23) y sleep_hours (0.19).</w:t>
+      </w:r>
+    </w:p>
+    <w:p>
+      <w:pPr>
+        <w:pStyle w:val="Heading1"/>
+      </w:pPr>
+      <w:r>
+        <w:rPr>
+          <w:color w:val="2C3E50"/>
+        </w:rPr>
+        <w:t>3. Variable objetivo (qué se quiere predecir)</w:t>
       </w:r>
     </w:p>
     <w:p>
@@ -635,7 +1032,7 @@
         <w:rPr>
           <w:color w:val="2C3E50"/>
         </w:rPr>
-        <w:t>Respuestas — Actividades (11 a 15)</w:t>
+        <w:t>Cómo se define la variable de riesgo</w:t>
       </w:r>
     </w:p>
     <w:p>
@@ -643,7 +1040,7 @@
         <w:rPr>
           <w:sz w:val="22"/>
         </w:rPr>
-        <w:t>11. COMPARACIÓN REGLAS vs MODELO:</w:t>
+        <w:t>DECISIÓN</w:t>
       </w:r>
     </w:p>
     <w:p>
@@ -651,7 +1048,7 @@
         <w:rPr>
           <w:sz w:val="22"/>
         </w:rPr>
-        <w:t xml:space="preserve">    • Ambos rankean a los alumnos de forma muy similar (corr. alta).</w:t>
+        <w:t>Como exam_score no está en escala 0-100 estándar, el umbral se define</w:t>
       </w:r>
     </w:p>
     <w:p>
@@ -659,7 +1056,7 @@
         <w:rPr>
           <w:sz w:val="22"/>
         </w:rPr>
-        <w:t xml:space="preserve">    • El score por reglas es totalmente transparente y auditable.</w:t>
+        <w:t>usando el cuartil inferior de la propia distribución: el 25 % de estudiantes</w:t>
       </w:r>
     </w:p>
     <w:p>
@@ -667,15 +1064,16 @@
         <w:rPr>
           <w:sz w:val="22"/>
         </w:rPr>
-        <w:t xml:space="preserve">    • El score por modelo capta interacciones no lineales y suele tener</w:t>
-      </w:r>
-    </w:p>
+        <w:t>con peor nota se considera 'bajo desempeño'.</w:t>
+      </w:r>
+    </w:p>
+    <w:p/>
     <w:p>
       <w:r>
         <w:rPr>
           <w:sz w:val="22"/>
         </w:rPr>
-        <w:t xml:space="preserve">      mejor AUC, pero pierde explicabilidad directa.</w:t>
+        <w:t>REGLA</w:t>
       </w:r>
     </w:p>
     <w:p>
@@ -683,7 +1081,7 @@
         <w:rPr>
           <w:sz w:val="22"/>
         </w:rPr>
-        <w:t xml:space="preserve">    • Recomendación: usar las reglas como score 'oficial' y el modelo</w:t>
+        <w:t xml:space="preserve">  riesgo_bajo_desempeno = 1   si exam_score &lt; 29.50</w:t>
       </w:r>
     </w:p>
     <w:p>
@@ -691,7 +1089,7 @@
         <w:rPr>
           <w:sz w:val="22"/>
         </w:rPr>
-        <w:t xml:space="preserve">      como validador. Si ambos coinciden en CRÍTICO → alta confianza.</w:t>
+        <w:t xml:space="preserve">  riesgo_bajo_desempeno = 0   en caso contrario</w:t>
       </w:r>
     </w:p>
     <w:p/>
@@ -700,7 +1098,7 @@
         <w:rPr>
           <w:sz w:val="22"/>
         </w:rPr>
-        <w:t>12. MÉTRICAS DE EVALUACIÓN:</w:t>
+        <w:t>DISTRIBUCIÓN OBSERVADA</w:t>
       </w:r>
     </w:p>
     <w:p>
@@ -708,7 +1106,7 @@
         <w:rPr>
           <w:sz w:val="22"/>
         </w:rPr>
-        <w:t xml:space="preserve">    • AUC-ROC LR ≈ 0.956  |  AUC-ROC RF ≈ 0.917.</w:t>
+        <w:t xml:space="preserve">  • Clase 0 (sin riesgo): 75.5 %</w:t>
       </w:r>
     </w:p>
     <w:p>
@@ -716,15 +1114,16 @@
         <w:rPr>
           <w:sz w:val="22"/>
         </w:rPr>
-        <w:t xml:space="preserve">    • Recall priorizado (no perder alumnos en riesgo real).</w:t>
-      </w:r>
-    </w:p>
+        <w:t xml:space="preserve">  • Clase 1 (riesgo):     24.5 %</w:t>
+      </w:r>
+    </w:p>
+    <w:p/>
     <w:p>
       <w:r>
         <w:rPr>
           <w:sz w:val="22"/>
         </w:rPr>
-        <w:t xml:space="preserve">    • Accuracy NO es buena métrica (clase desbalanceada ~25 %).</w:t>
+        <w:t>Es un criterio relativo, transparente y reproducible. En otra cohorte habría</w:t>
       </w:r>
     </w:p>
     <w:p>
@@ -732,130 +1131,7 @@
         <w:rPr>
           <w:sz w:val="22"/>
         </w:rPr>
-        <w:t xml:space="preserve">    • Matriz de confusión, precision y F1 también reportadas.</w:t>
-      </w:r>
-    </w:p>
-    <w:p/>
-    <w:p>
-      <w:r>
-        <w:rPr>
-          <w:sz w:val="22"/>
-        </w:rPr>
-        <w:t>13. FALSOS POSITIVOS vs FALSOS NEGATIVOS:</w:t>
-      </w:r>
-    </w:p>
-    <w:p>
-      <w:r>
-        <w:rPr>
-          <w:sz w:val="22"/>
-        </w:rPr>
-        <w:t xml:space="preserve">    • FN (decir 'sin riesgo' y desaprobar): MUY GRAVE — alumno sin ayuda.</w:t>
-      </w:r>
-    </w:p>
-    <w:p>
-      <w:r>
-        <w:rPr>
-          <w:sz w:val="22"/>
-        </w:rPr>
-        <w:t xml:space="preserve">    • FP (decir 'riesgo' y aprobar): leve — una tutoría 'de más'.</w:t>
-      </w:r>
-    </w:p>
-    <w:p>
-      <w:r>
-        <w:rPr>
-          <w:sz w:val="22"/>
-        </w:rPr>
-        <w:t xml:space="preserve">    • Por eso el umbral se elige para MAXIMIZAR RECALL aceptando algo</w:t>
-      </w:r>
-    </w:p>
-    <w:p>
-      <w:r>
-        <w:rPr>
-          <w:sz w:val="22"/>
-        </w:rPr>
-        <w:t xml:space="preserve">      más de FP. El costo asimétrico justifica priorizar sensibilidad.</w:t>
-      </w:r>
-    </w:p>
-    <w:p/>
-    <w:p>
-      <w:r>
-        <w:rPr>
-          <w:sz w:val="22"/>
-        </w:rPr>
-        <w:t>14. VISUALIZACIONES INCLUIDAS EN ESTE REPORTE:</w:t>
-      </w:r>
-    </w:p>
-    <w:p>
-      <w:r>
-        <w:rPr>
-          <w:sz w:val="22"/>
-        </w:rPr>
-        <w:t xml:space="preserve">    • Histograma de score_reglas y score_modelo.</w:t>
-      </w:r>
-    </w:p>
-    <w:p>
-      <w:r>
-        <w:rPr>
-          <w:sz w:val="22"/>
-        </w:rPr>
-        <w:t xml:space="preserve">    • Distribución por nivel de riesgo (bajo/medio/alto/crítico).</w:t>
-      </w:r>
-    </w:p>
-    <w:p>
-      <w:r>
-        <w:rPr>
-          <w:sz w:val="22"/>
-        </w:rPr>
-        <w:t xml:space="preserve">    • Curva ROC, matriz de confusión, scatter reglas vs modelo.</w:t>
-      </w:r>
-    </w:p>
-    <w:p/>
-    <w:p>
-      <w:r>
-        <w:rPr>
-          <w:sz w:val="22"/>
-        </w:rPr>
-        <w:t>15. CONCLUSIONES, LIMITACIONES Y MEJORAS:</w:t>
-      </w:r>
-    </w:p>
-    <w:p>
-      <w:r>
-        <w:rPr>
-          <w:sz w:val="22"/>
-        </w:rPr>
-        <w:t xml:space="preserve">    • Conclusión: ambos enfoques son consistentes y útiles como alerta</w:t>
-      </w:r>
-    </w:p>
-    <w:p>
-      <w:r>
-        <w:rPr>
-          <w:sz w:val="22"/>
-        </w:rPr>
-        <w:t xml:space="preserve">      temprana antes del examen final.</w:t>
-      </w:r>
-    </w:p>
-    <w:p>
-      <w:r>
-        <w:rPr>
-          <w:sz w:val="22"/>
-        </w:rPr>
-        <w:t xml:space="preserve">    • Limitaciones: n=200, una sola cohorte, variables autodeclaradas.</w:t>
-      </w:r>
-    </w:p>
-    <w:p>
-      <w:r>
-        <w:rPr>
-          <w:sz w:val="22"/>
-        </w:rPr>
-        <w:t xml:space="preserve">    • Mejoras: recalibrar umbrales cada cuatrimestre, agregar variables</w:t>
-      </w:r>
-    </w:p>
-    <w:p>
-      <w:r>
-        <w:rPr>
-          <w:sz w:val="22"/>
-        </w:rPr>
-        <w:t xml:space="preserve">      del aula virtual (entregas, asistencia real), monitorear sesgos.</w:t>
+        <w:t>que recalibrar el umbral.</w:t>
       </w:r>
     </w:p>
     <w:p>
@@ -866,7 +1142,18 @@
         <w:rPr>
           <w:color w:val="2C3E50"/>
         </w:rPr>
-        <w:t>7. Preguntas orientadoras para profundizar</w:t>
+        <w:t>4. Scoring por reglas (pesos y rangos definidos a mano)</w:t>
+      </w:r>
+    </w:p>
+    <w:p>
+      <w:pPr>
+        <w:pStyle w:val="Heading1"/>
+      </w:pPr>
+      <w:r>
+        <w:rPr>
+          <w:color w:val="2C3E50"/>
+        </w:rPr>
+        <w:t>5. Niveles de riesgo y acción recomendada</w:t>
       </w:r>
     </w:p>
     <w:p>
@@ -877,7 +1164,7 @@
         <w:rPr>
           <w:color w:val="2C3E50"/>
         </w:rPr>
-        <w:t>Comprensión del problema</w:t>
+        <w:t>El score crece con el riesgo real (validación empírica)</w:t>
       </w:r>
     </w:p>
     <w:p>
@@ -885,7 +1172,15 @@
         <w:rPr>
           <w:sz w:val="22"/>
         </w:rPr>
-        <w:t>• ¿Qué decisión concreta se busca apoyar con el score?</w:t>
+        <w:t>Si el score por reglas funciona, la 'tasa de bajo desempeño' debe crecer</w:t>
+      </w:r>
+    </w:p>
+    <w:p>
+      <w:r>
+        <w:rPr>
+          <w:sz w:val="22"/>
+        </w:rPr>
+        <w:t>monotónicamente del nivel Bajo al Crítico. Es lo que se observa:</w:t>
       </w:r>
     </w:p>
     <w:p/>
@@ -894,7 +1189,31 @@
         <w:rPr>
           <w:sz w:val="22"/>
         </w:rPr>
-        <w:t>• ¿Quién lo utilizará y en qué momento?</w:t>
+        <w:t xml:space="preserve">  Bajo    →   0.0 % de los estudiantes desaprueba</w:t>
+      </w:r>
+    </w:p>
+    <w:p>
+      <w:r>
+        <w:rPr>
+          <w:sz w:val="22"/>
+        </w:rPr>
+        <w:t xml:space="preserve">  Medio   →   1.5 %</w:t>
+      </w:r>
+    </w:p>
+    <w:p>
+      <w:r>
+        <w:rPr>
+          <w:sz w:val="22"/>
+        </w:rPr>
+        <w:t xml:space="preserve">  Alto    →  34.4 %</w:t>
+      </w:r>
+    </w:p>
+    <w:p>
+      <w:r>
+        <w:rPr>
+          <w:sz w:val="22"/>
+        </w:rPr>
+        <w:t xml:space="preserve">  Crítico →  84.4 %</w:t>
       </w:r>
     </w:p>
     <w:p/>
@@ -903,7 +1222,26 @@
         <w:rPr>
           <w:sz w:val="22"/>
         </w:rPr>
-        <w:t>• ¿Cuál es la diferencia entre scoring, clasificación y predicción?</w:t>
+        <w:t>El salto entre Alto y Crítico es la señal más fuerte: el score por reglas</w:t>
+      </w:r>
+    </w:p>
+    <w:p>
+      <w:r>
+        <w:rPr>
+          <w:sz w:val="22"/>
+        </w:rPr>
+        <w:t>logra concentrar el riesgo real en el extremo superior de la escala.</w:t>
+      </w:r>
+    </w:p>
+    <w:p>
+      <w:pPr>
+        <w:pStyle w:val="Heading1"/>
+      </w:pPr>
+      <w:r>
+        <w:rPr>
+          <w:color w:val="2C3E50"/>
+        </w:rPr>
+        <w:t>6. Modelo predictivo entrenado con scikit-learn</w:t>
       </w:r>
     </w:p>
     <w:p>
@@ -914,7 +1252,7 @@
         <w:rPr>
           <w:color w:val="2C3E50"/>
         </w:rPr>
-        <w:t>Respuestas — Comprensión del problema</w:t>
+        <w:t>Tipo de problema, variables y modelos comparados</w:t>
       </w:r>
     </w:p>
     <w:p>
@@ -922,7 +1260,7 @@
         <w:rPr>
           <w:sz w:val="22"/>
         </w:rPr>
-        <w:t>¿QUÉ DECISIÓN CONCRETA SE BUSCA APOYAR CON EL SCORE?</w:t>
+        <w:t>TIPO DE PROBLEMA</w:t>
       </w:r>
     </w:p>
     <w:p>
@@ -930,7 +1268,7 @@
         <w:rPr>
           <w:sz w:val="22"/>
         </w:rPr>
-        <w:t>Identificar, antes del examen final, qué estudiantes tienen mayor riesgo</w:t>
+        <w:t>Clasificación binaria (riesgo / no riesgo). El usuario final necesita decidir</w:t>
       </w:r>
     </w:p>
     <w:p>
@@ -938,15 +1276,16 @@
         <w:rPr>
           <w:sz w:val="22"/>
         </w:rPr>
-        <w:t>de bajo desempeño para activar intervenciones de la cátedra: tutorías,</w:t>
-      </w:r>
-    </w:p>
+        <w:t>intervenir o no — output operativo, no estimar la nota exacta.</w:t>
+      </w:r>
+    </w:p>
+    <w:p/>
     <w:p>
       <w:r>
         <w:rPr>
           <w:sz w:val="22"/>
         </w:rPr>
-        <w:t>material de refuerzo, seguimiento personalizado y, en casos críticos,</w:t>
+        <w:t>VARIABLES PREDICTORAS</w:t>
       </w:r>
     </w:p>
     <w:p>
@@ -954,7 +1293,15 @@
         <w:rPr>
           <w:sz w:val="22"/>
         </w:rPr>
-        <w:t>tutoría obligatoria con seguimiento semanal.</w:t>
+        <w:t>hours_studied, sleep_hours, attendance_percent, previous_scores.</w:t>
+      </w:r>
+    </w:p>
+    <w:p>
+      <w:r>
+        <w:rPr>
+          <w:sz w:val="22"/>
+        </w:rPr>
+        <w:t>Disponibles ANTES del examen final. exam_score se excluye (data leakage).</w:t>
       </w:r>
     </w:p>
     <w:p/>
@@ -963,7 +1310,7 @@
         <w:rPr>
           <w:sz w:val="22"/>
         </w:rPr>
-        <w:t>¿QUIÉN LO UTILIZARÁ Y EN QUÉ MOMENTO?</w:t>
+        <w:t>MODELOS COMPARADOS</w:t>
       </w:r>
     </w:p>
     <w:p>
@@ -971,7 +1318,7 @@
         <w:rPr>
           <w:sz w:val="22"/>
         </w:rPr>
-        <w:t>Tutores, coordinador académico y docente del curso. Se aplica al inicio</w:t>
+        <w:t>• Logistic Regression: interpretable, rápido, baseline.</w:t>
       </w:r>
     </w:p>
     <w:p>
@@ -979,7 +1326,7 @@
         <w:rPr>
           <w:sz w:val="22"/>
         </w:rPr>
-        <w:t>o a mitad del cuatrimestre, ANTES del examen final — por eso exam_score</w:t>
+        <w:t>• Random Forest: capta no-linealidades, robusto a outliers.</w:t>
       </w:r>
     </w:p>
     <w:p>
@@ -987,24 +1334,24 @@
         <w:rPr>
           <w:sz w:val="22"/>
         </w:rPr>
-        <w:t>no se usa como variable predictora (sería data leakage: se predeciría</w:t>
-      </w:r>
-    </w:p>
+        <w:t>Se elige el de mejor AUC en validación cruzada (5 folds).</w:t>
+      </w:r>
+    </w:p>
+    <w:p/>
     <w:p>
       <w:r>
         <w:rPr>
           <w:sz w:val="22"/>
         </w:rPr>
-        <w:t>una decisión usando información que aún no se conoce).</w:t>
-      </w:r>
-    </w:p>
-    <w:p/>
+        <w:t>OTRAS DECISIONES</w:t>
+      </w:r>
+    </w:p>
     <w:p>
       <w:r>
         <w:rPr>
           <w:sz w:val="22"/>
         </w:rPr>
-        <w:t>¿CUÁL ES LA DIFERENCIA ENTRE SCORING, CLASIFICACIÓN Y PREDICCIÓN?</w:t>
+        <w:t>• train/test estratificado (clase positiva ≈ 25 %).</w:t>
       </w:r>
     </w:p>
     <w:p>
@@ -1012,7 +1359,7 @@
         <w:rPr>
           <w:sz w:val="22"/>
         </w:rPr>
-        <w:t>• Predicción: estima el VALOR de una variable continua (ej. la nota</w:t>
+        <w:t>• StandardScaler en LR (sensible a escalas).</w:t>
       </w:r>
     </w:p>
     <w:p>
@@ -1020,55 +1367,29 @@
         <w:rPr>
           <w:sz w:val="22"/>
         </w:rPr>
-        <w:t xml:space="preserve">  exacta en el examen). Es regresión.</w:t>
-      </w:r>
-    </w:p>
-    <w:p>
-      <w:r>
-        <w:rPr>
-          <w:sz w:val="22"/>
-        </w:rPr>
-        <w:t>• Clasificación: asigna una ETIQUETA discreta (ej. desaprueba sí/no).</w:t>
-      </w:r>
-    </w:p>
-    <w:p>
-      <w:r>
-        <w:rPr>
-          <w:sz w:val="22"/>
-        </w:rPr>
-        <w:t xml:space="preserve">  Su salida es binaria o multiclase, no permite priorizar dentro de</w:t>
-      </w:r>
-    </w:p>
-    <w:p>
-      <w:r>
-        <w:rPr>
-          <w:sz w:val="22"/>
-        </w:rPr>
-        <w:t xml:space="preserve">  cada clase.</w:t>
-      </w:r>
-    </w:p>
-    <w:p>
-      <w:r>
-        <w:rPr>
-          <w:sz w:val="22"/>
-        </w:rPr>
-        <w:t>• Scoring: ORDENA a los individuos en una escala continua (0-100) para</w:t>
-      </w:r>
-    </w:p>
-    <w:p>
-      <w:r>
-        <w:rPr>
-          <w:sz w:val="22"/>
-        </w:rPr>
-        <w:t xml:space="preserve">  priorizar acciones. Permite elegir el umbral según la capacidad</w:t>
-      </w:r>
-    </w:p>
-    <w:p>
-      <w:r>
-        <w:rPr>
-          <w:sz w:val="22"/>
-        </w:rPr>
-        <w:t xml:space="preserve">  operativa (cuántas tutorías hay disponibles).</w:t>
+        <w:t>• Random state = 42 para reproducibilidad.</w:t>
+      </w:r>
+    </w:p>
+    <w:p>
+      <w:pPr>
+        <w:pStyle w:val="Heading1"/>
+      </w:pPr>
+      <w:r>
+        <w:rPr>
+          <w:color w:val="2C3E50"/>
+        </w:rPr>
+        <w:t>7. Comparación entre score por reglas y score por modelo</w:t>
+      </w:r>
+    </w:p>
+    <w:p>
+      <w:pPr>
+        <w:pStyle w:val="Heading1"/>
+      </w:pPr>
+      <w:r>
+        <w:rPr>
+          <w:color w:val="2C3E50"/>
+        </w:rPr>
+        <w:t>8. Evaluación del modelo con métricas de clasificación</w:t>
       </w:r>
     </w:p>
     <w:p>
@@ -1079,7 +1400,7 @@
         <w:rPr>
           <w:color w:val="2C3E50"/>
         </w:rPr>
-        <w:t>Diseño del score</w:t>
+        <w:t>Qué error pesa más en este problema</w:t>
       </w:r>
     </w:p>
     <w:p>
@@ -1087,7 +1408,7 @@
         <w:rPr>
           <w:sz w:val="22"/>
         </w:rPr>
-        <w:t>• ¿Qué variables son más relevantes y por qué?</w:t>
+        <w:t>EN ESTE PROBLEMA, EL FALSO NEGATIVO ES MÁS GRAVE</w:t>
       </w:r>
     </w:p>
     <w:p/>
@@ -1096,7 +1417,15 @@
         <w:rPr>
           <w:sz w:val="22"/>
         </w:rPr>
-        <w:t>• ¿Cómo se justifican los pesos asignados?</w:t>
+        <w:t>• FALSO NEGATIVO: el score dice 'sin riesgo' pero el estudiante desaprueba.</w:t>
+      </w:r>
+    </w:p>
+    <w:p>
+      <w:r>
+        <w:rPr>
+          <w:sz w:val="22"/>
+        </w:rPr>
+        <w:t xml:space="preserve">  Costo: no recibió la intervención y termina desaprobando.</w:t>
       </w:r>
     </w:p>
     <w:p/>
@@ -1105,7 +1434,15 @@
         <w:rPr>
           <w:sz w:val="22"/>
         </w:rPr>
-        <w:t>• ¿Qué pasa si una variable está en una escala distinta a las demás?</w:t>
+        <w:t>• FALSO POSITIVO: el score dice 'riesgo' pero el estudiante aprueba.</w:t>
+      </w:r>
+    </w:p>
+    <w:p>
+      <w:r>
+        <w:rPr>
+          <w:sz w:val="22"/>
+        </w:rPr>
+        <w:t xml:space="preserve">  Costo: una entrevista innecesaria del tutor.</w:t>
       </w:r>
     </w:p>
     <w:p/>
@@ -1114,7 +1451,15 @@
         <w:rPr>
           <w:sz w:val="22"/>
         </w:rPr>
-        <w:t>• ¿Cómo se eligen los umbrales o niveles de score?</w:t>
+        <w:t>→ Priorizamos RECALL sobre la clase positiva (riesgo). Para un score operativo,</w:t>
+      </w:r>
+    </w:p>
+    <w:p>
+      <w:r>
+        <w:rPr>
+          <w:sz w:val="22"/>
+        </w:rPr>
+        <w:t>fijamos un umbral que capture al menos el 70-80 % de los casos positivos.</w:t>
       </w:r>
     </w:p>
     <w:p>
@@ -1125,7 +1470,7 @@
         <w:rPr>
           <w:color w:val="2C3E50"/>
         </w:rPr>
-        <w:t>Respuestas — Diseño del score</w:t>
+        <w:t>Qué dice la matriz de confusión en el umbral operativo</w:t>
       </w:r>
     </w:p>
     <w:p>
@@ -1133,15 +1478,16 @@
         <w:rPr>
           <w:sz w:val="22"/>
         </w:rPr>
-        <w:t>¿QUÉ VARIABLES SON MÁS RELEVANTES Y POR QUÉ?</w:t>
-      </w:r>
-    </w:p>
+        <w:t>En el set de test (n = 60) y con umbral operativo 50:</w:t>
+      </w:r>
+    </w:p>
+    <w:p/>
     <w:p>
       <w:r>
         <w:rPr>
           <w:sz w:val="22"/>
         </w:rPr>
-        <w:t>Según el EDA, hours_studied es la más fuerte (r = 0.78 con exam_score),</w:t>
+        <w:t xml:space="preserve">  → De 15 estudiantes con riesgo real, el modelo detectó 12</w:t>
       </w:r>
     </w:p>
     <w:p>
@@ -1149,15 +1495,16 @@
         <w:rPr>
           <w:sz w:val="22"/>
         </w:rPr>
-        <w:t>seguida de previous_scores (r = 0.43), attendance_percent (r = 0.23) y</w:t>
-      </w:r>
-    </w:p>
+        <w:t xml:space="preserve">    y dejó pasar 3  (recall = 80%).</w:t>
+      </w:r>
+    </w:p>
+    <w:p/>
     <w:p>
       <w:r>
         <w:rPr>
           <w:sz w:val="22"/>
         </w:rPr>
-        <w:t>sleep_hours (r = 0.19). Las dos primeras concentran ~70 % del poder</w:t>
+        <w:t xml:space="preserve">  → De 45 estudiantes sin riesgo, el modelo clasificó bien 44</w:t>
       </w:r>
     </w:p>
     <w:p>
@@ -1165,15 +1512,16 @@
         <w:rPr>
           <w:sz w:val="22"/>
         </w:rPr>
-        <w:t>predictivo; las dos restantes se incluyen porque tienen sustento</w:t>
-      </w:r>
-    </w:p>
+        <w:t xml:space="preserve">    y marcó 1 como riesgo erróneamente  (specificity = 98%).</w:t>
+      </w:r>
+    </w:p>
+    <w:p/>
     <w:p>
       <w:r>
         <w:rPr>
           <w:sz w:val="22"/>
         </w:rPr>
-        <w:t>teórico (compromiso y descanso afectan rendimiento) aunque correlacionen</w:t>
+        <w:t xml:space="preserve">  → De los 13 alumnos que el modelo señaló como en riesgo,</w:t>
       </w:r>
     </w:p>
     <w:p>
@@ -1181,7 +1529,7 @@
         <w:rPr>
           <w:sz w:val="22"/>
         </w:rPr>
-        <w:t>menos.</w:t>
+        <w:t xml:space="preserve">    12 efectivamente lo estaban  (precision = 92%).</w:t>
       </w:r>
     </w:p>
     <w:p/>
@@ -1190,15 +1538,16 @@
         <w:rPr>
           <w:sz w:val="22"/>
         </w:rPr>
-        <w:t>¿CÓMO SE JUSTIFICAN LOS PESOS ASIGNADOS?</w:t>
-      </w:r>
-    </w:p>
+        <w:t>INTERPRETACIÓN OPERATIVA</w:t>
+      </w:r>
+    </w:p>
+    <w:p/>
     <w:p>
       <w:r>
         <w:rPr>
           <w:sz w:val="22"/>
         </w:rPr>
-        <w:t>Los pesos (40 / 30 / 20 / 10 %) replican el ORDEN de correlación con</w:t>
+        <w:t>• Falsos negativos = 3  ← son los más graves: el sistema dice 'no</w:t>
       </w:r>
     </w:p>
     <w:p>
@@ -1206,7 +1555,7 @@
         <w:rPr>
           <w:sz w:val="22"/>
         </w:rPr>
-        <w:t>exam_score y respetan que la suma sea 100 %. No vienen de un ajuste</w:t>
+        <w:t xml:space="preserve">  hace falta intervenir' y el alumno termina desaprobando. Cada FN</w:t>
       </w:r>
     </w:p>
     <w:p>
@@ -1214,15 +1563,24 @@
         <w:rPr>
           <w:sz w:val="22"/>
         </w:rPr>
-        <w:t>automático sino de criterio experto + evidencia del EDA. Esto los hace</w:t>
-      </w:r>
-    </w:p>
+        <w:t xml:space="preserve">  representa una oportunidad perdida de ayudar.</w:t>
+      </w:r>
+    </w:p>
+    <w:p/>
     <w:p>
       <w:r>
         <w:rPr>
           <w:sz w:val="22"/>
         </w:rPr>
-        <w:t>auditables y explicables ante un usuario no técnico.</w:t>
+        <w:t>• Falsos positivos = 1  ← son tolerables: solo cuestan una entrevista</w:t>
+      </w:r>
+    </w:p>
+    <w:p>
+      <w:r>
+        <w:rPr>
+          <w:sz w:val="22"/>
+        </w:rPr>
+        <w:t xml:space="preserve">  innecesaria con el tutor.</w:t>
       </w:r>
     </w:p>
     <w:p/>
@@ -1231,7 +1589,7 @@
         <w:rPr>
           <w:sz w:val="22"/>
         </w:rPr>
-        <w:t>¿QUÉ PASA SI UNA VARIABLE ESTÁ EN UNA ESCALA DISTINTA?</w:t>
+        <w:t>• Si la cátedra tuviera capacidad para más casos, podría bajar el</w:t>
       </w:r>
     </w:p>
     <w:p>
@@ -1239,7 +1597,7 @@
         <w:rPr>
           <w:sz w:val="22"/>
         </w:rPr>
-        <w:t>Hay que NORMALIZAR antes de combinar. En el score por reglas se usa</w:t>
+        <w:t xml:space="preserve">  umbral (ej. a 40) y subir recall a costa de algo de precision.</w:t>
       </w:r>
     </w:p>
     <w:p>
@@ -1247,7 +1605,7 @@
         <w:rPr>
           <w:sz w:val="22"/>
         </w:rPr>
-        <w:t>norm_riesgo(valor, bueno, malo) que mapea cada variable a [0, 100] con</w:t>
+        <w:t xml:space="preserve">  Si la capacidad fuera muy escasa, subir el umbral (ej. a 60) elevaría</w:t>
       </w:r>
     </w:p>
     <w:p>
@@ -1255,15 +1613,16 @@
         <w:rPr>
           <w:sz w:val="22"/>
         </w:rPr>
-        <w:t>rangos definidos por dominio. En el modelo, StandardScaler estandariza</w:t>
-      </w:r>
-    </w:p>
+        <w:t xml:space="preserve">  precision pero dejaría más alumnos en riesgo sin ayuda.</w:t>
+      </w:r>
+    </w:p>
+    <w:p/>
     <w:p>
       <w:r>
         <w:rPr>
           <w:sz w:val="22"/>
         </w:rPr>
-        <w:t>(media 0, std 1) para que LogisticRegression no penalice variables</w:t>
+        <w:t>La tabla de la próxima página muestra esa misma matriz pero a 4 umbrales,</w:t>
       </w:r>
     </w:p>
     <w:p>
@@ -1271,56 +1630,18 @@
         <w:rPr>
           <w:sz w:val="22"/>
         </w:rPr>
-        <w:t>con mayor varianza nominal.</w:t>
-      </w:r>
-    </w:p>
-    <w:p/>
-    <w:p>
-      <w:r>
-        <w:rPr>
-          <w:sz w:val="22"/>
-        </w:rPr>
-        <w:t>¿CÓMO SE ELIGEN LOS UMBRALES O NIVELES DE SCORE?</w:t>
-      </w:r>
-    </w:p>
-    <w:p>
-      <w:r>
-        <w:rPr>
-          <w:sz w:val="22"/>
-        </w:rPr>
-        <w:t>Se usaron cortes en 30 / 50 / 70 que dividen la escala en cuatro</w:t>
-      </w:r>
-    </w:p>
-    <w:p>
-      <w:r>
-        <w:rPr>
-          <w:sz w:val="22"/>
-        </w:rPr>
-        <w:t>niveles operativos (Bajo / Medio / Alto / Crítico) y se VALIDARON</w:t>
-      </w:r>
-    </w:p>
-    <w:p>
-      <w:r>
-        <w:rPr>
-          <w:sz w:val="22"/>
-        </w:rPr>
-        <w:t>empíricamente: la tasa real de bajo desempeño debe crecer monotónicamente</w:t>
-      </w:r>
-    </w:p>
-    <w:p>
-      <w:r>
-        <w:rPr>
-          <w:sz w:val="22"/>
-        </w:rPr>
-        <w:t>de Bajo a Crítico, lo que se cumple. En otra cohorte habría que</w:t>
-      </w:r>
-    </w:p>
-    <w:p>
-      <w:r>
-        <w:rPr>
-          <w:sz w:val="22"/>
-        </w:rPr>
-        <w:t>recalibrarlos.</w:t>
+        <w:t>para apoyar la decisión del corte operativo.</w:t>
+      </w:r>
+    </w:p>
+    <w:p>
+      <w:pPr>
+        <w:pStyle w:val="Heading1"/>
+      </w:pPr>
+      <w:r>
+        <w:rPr>
+          <w:color w:val="2C3E50"/>
+        </w:rPr>
+        <w:t>9. Casos individuales (tres estudiantes de ejemplo)</w:t>
       </w:r>
     </w:p>
     <w:p>
@@ -1331,7 +1652,7 @@
         <w:rPr>
           <w:color w:val="2C3E50"/>
         </w:rPr>
-        <w:t>Modelo predictivo</w:t>
+        <w:t>Ejemplo: cómo explicar el score a un estudiante</w:t>
       </w:r>
     </w:p>
     <w:p>
@@ -1339,7 +1660,7 @@
         <w:rPr>
           <w:sz w:val="22"/>
         </w:rPr>
-        <w:t>• ¿Qué tipo de problema es: clasificación binaria, multiclase, regresión?</w:t>
+        <w:t>EJEMPLO — caso crítico</w:t>
       </w:r>
     </w:p>
     <w:p/>
@@ -1348,7 +1669,7 @@
         <w:rPr>
           <w:sz w:val="22"/>
         </w:rPr>
-        <w:t>• ¿Por qué se eligió ese algoritmo (regresión logística, árbol, random</w:t>
+        <w:t>Estudiante S125 recibió un score alto porque combina:</w:t>
       </w:r>
     </w:p>
     <w:p>
@@ -1356,7 +1677,31 @@
         <w:rPr>
           <w:sz w:val="22"/>
         </w:rPr>
-        <w:t xml:space="preserve">  forest, etc.)?</w:t>
+        <w:t xml:space="preserve">  • 1.0 horas de estudio (rango bajo: ≤ 2 hs)</w:t>
+      </w:r>
+    </w:p>
+    <w:p>
+      <w:r>
+        <w:rPr>
+          <w:sz w:val="22"/>
+        </w:rPr>
+        <w:t xml:space="preserve">  • 54 en desempeño previo (rango bajo: ≤ 50)</w:t>
+      </w:r>
+    </w:p>
+    <w:p>
+      <w:r>
+        <w:rPr>
+          <w:sz w:val="22"/>
+        </w:rPr>
+        <w:t xml:space="preserve">  • 82.6 % de asistencia</w:t>
+      </w:r>
+    </w:p>
+    <w:p>
+      <w:r>
+        <w:rPr>
+          <w:sz w:val="22"/>
+        </w:rPr>
+        <w:t xml:space="preserve">  • 4.1 horas promedio de sueño</w:t>
       </w:r>
     </w:p>
     <w:p/>
@@ -1365,7 +1710,7 @@
         <w:rPr>
           <w:sz w:val="22"/>
         </w:rPr>
-        <w:t>• ¿Qué decisiones de preprocesamiento se tomaron (split, escalado,</w:t>
+        <w:t>Las variables apuntan en la misma dirección, por eso el score lo ubica en el</w:t>
       </w:r>
     </w:p>
     <w:p>
@@ -1373,7 +1718,35 @@
         <w:rPr>
           <w:sz w:val="22"/>
         </w:rPr>
-        <w:t xml:space="preserve">  encoding)?</w:t>
+        <w:t>nivel crítico y se recomienda tutoría obligatoria con seguimiento semanal.</w:t>
+      </w:r>
+    </w:p>
+    <w:p/>
+    <w:p>
+      <w:r>
+        <w:rPr>
+          <w:sz w:val="22"/>
+        </w:rPr>
+        <w:t>El estudiante puede 'mejorar' su score aumentando horas de estudio y asistencia</w:t>
+      </w:r>
+    </w:p>
+    <w:p>
+      <w:r>
+        <w:rPr>
+          <w:sz w:val="22"/>
+        </w:rPr>
+        <w:t>(las dos variables más controlables a corto plazo).</w:t>
+      </w:r>
+    </w:p>
+    <w:p>
+      <w:pPr>
+        <w:pStyle w:val="Heading1"/>
+      </w:pPr>
+      <w:r>
+        <w:rPr>
+          <w:color w:val="2C3E50"/>
+        </w:rPr>
+        <w:t>10. Nueve scores complementarios para otras decisiones</w:t>
       </w:r>
     </w:p>
     <w:p>
@@ -1384,7 +1757,7 @@
         <w:rPr>
           <w:color w:val="2C3E50"/>
         </w:rPr>
-        <w:t>Respuestas — Modelo predictivo</w:t>
+        <w:t>Para qué sirven los 9 scores complementarios</w:t>
       </w:r>
     </w:p>
     <w:p>
@@ -1392,7 +1765,7 @@
         <w:rPr>
           <w:sz w:val="22"/>
         </w:rPr>
-        <w:t>¿QUÉ TIPO DE PROBLEMA ES?</w:t>
+        <w:t>El score de riesgo es solo un ángulo del problema. A partir del mismo dataset</w:t>
       </w:r>
     </w:p>
     <w:p>
@@ -1400,7 +1773,7 @@
         <w:rPr>
           <w:sz w:val="22"/>
         </w:rPr>
-        <w:t>CLASIFICACIÓN BINARIA: predice riesgo_bajo_desempeno ∈ {0, 1}. La</w:t>
+        <w:t>podemos construir scores complementarios que apoyan distintas decisiones de la</w:t>
       </w:r>
     </w:p>
     <w:p>
@@ -1408,7 +1781,7 @@
         <w:rPr>
           <w:sz w:val="22"/>
         </w:rPr>
-        <w:t>decisión que necesita el tutor es operativa (intervenir o no), no</w:t>
+        <w:t>cátedra: priorizar tutorías, reconocer trayectorias positivas, detectar</w:t>
       </w:r>
     </w:p>
     <w:p>
@@ -1416,7 +1789,7 @@
         <w:rPr>
           <w:sz w:val="22"/>
         </w:rPr>
-        <w:t>estimar la nota exacta. Aunque internamente se trabaje con la</w:t>
+        <w:t>ineficiencias en la técnica de estudio, alertar sobre desbalance vida-estudio,</w:t>
       </w:r>
     </w:p>
     <w:p>
@@ -1424,15 +1797,24 @@
         <w:rPr>
           <w:sz w:val="22"/>
         </w:rPr>
-        <w:t>probabilidad continua P(riesgo), eso es para SCORING, no para</w:t>
-      </w:r>
-    </w:p>
+        <w:t>predecir abandono, etc.</w:t>
+      </w:r>
+    </w:p>
+    <w:p/>
     <w:p>
       <w:r>
         <w:rPr>
           <w:sz w:val="22"/>
         </w:rPr>
-        <w:t>regresión sobre exam_score.</w:t>
+        <w:t>Cada score se acota a la escala 0-100. Las normalizaciones por percentil hacen</w:t>
+      </w:r>
+    </w:p>
+    <w:p>
+      <w:r>
+        <w:rPr>
+          <w:sz w:val="22"/>
+        </w:rPr>
+        <w:t>que los scores sean robustos a la escala atípica de exam_score (max ≈ 51).</w:t>
       </w:r>
     </w:p>
     <w:p/>
@@ -1441,7 +1823,7 @@
         <w:rPr>
           <w:sz w:val="22"/>
         </w:rPr>
-        <w:t>¿POR QUÉ SE ELIGIÓ ESE ALGORITMO?</w:t>
+        <w:t>Los 9 scores no son redundantes: cada uno apunta a una decisión distinta.</w:t>
       </w:r>
     </w:p>
     <w:p>
@@ -1449,15 +1831,16 @@
         <w:rPr>
           <w:sz w:val="22"/>
         </w:rPr>
-        <w:t>Se compararon dos modelos con validación cruzada (5 folds, AUC):</w:t>
-      </w:r>
-    </w:p>
+        <w:t>Pueden combinarse — por ejemplo, riesgo alto + potencial alto = prioridad máxima.</w:t>
+      </w:r>
+    </w:p>
+    <w:p/>
     <w:p>
       <w:r>
         <w:rPr>
           <w:sz w:val="22"/>
         </w:rPr>
-        <w:t>• Logistic Regression: lineal, INTERPRETABLE (coeficientes leíbles),</w:t>
+        <w:t>ATENCIÓN — score_desercion es un PROXY. El dataset no tiene etiqueta real de</w:t>
       </w:r>
     </w:p>
     <w:p>
@@ -1465,7 +1848,7 @@
         <w:rPr>
           <w:sz w:val="22"/>
         </w:rPr>
-        <w:t xml:space="preserve">  rápido, sirve como baseline robusto.</w:t>
+        <w:t>abandono, así que el score se construye con criterios de literatura (asistencia</w:t>
       </w:r>
     </w:p>
     <w:p>
@@ -1473,7 +1856,7 @@
         <w:rPr>
           <w:sz w:val="22"/>
         </w:rPr>
-        <w:t>• Random Forest: capta no-linealidades e interacciones, más robusto a</w:t>
+        <w:t>como predictor más fuerte) pero NO se puede validar con AUC. Su uso debe ser</w:t>
       </w:r>
     </w:p>
     <w:p>
@@ -1481,96 +1864,7 @@
         <w:rPr>
           <w:sz w:val="22"/>
         </w:rPr>
-        <w:t xml:space="preserve">  outliers, no requiere escalado.</w:t>
-      </w:r>
-    </w:p>
-    <w:p>
-      <w:r>
-        <w:rPr>
-          <w:sz w:val="22"/>
-        </w:rPr>
-        <w:t>Se eligió el de mejor AUC en CV. En contextos académicos con n pequeño</w:t>
-      </w:r>
-    </w:p>
-    <w:p>
-      <w:r>
-        <w:rPr>
-          <w:sz w:val="22"/>
-        </w:rPr>
-        <w:t>y necesidad de explicabilidad, LR suele ganar — fue el caso (AUC = 0.956</w:t>
-      </w:r>
-    </w:p>
-    <w:p>
-      <w:r>
-        <w:rPr>
-          <w:sz w:val="22"/>
-        </w:rPr>
-        <w:t>vs 0.917).</w:t>
-      </w:r>
-    </w:p>
-    <w:p/>
-    <w:p>
-      <w:r>
-        <w:rPr>
-          <w:sz w:val="22"/>
-        </w:rPr>
-        <w:t>¿QUÉ DECISIONES DE PREPROCESAMIENTO SE TOMARON?</w:t>
-      </w:r>
-    </w:p>
-    <w:p>
-      <w:r>
-        <w:rPr>
-          <w:sz w:val="22"/>
-        </w:rPr>
-        <w:t>• SPLIT: train/test 70/30 ESTRATIFICADO por la clase positiva (~25 %)</w:t>
-      </w:r>
-    </w:p>
-    <w:p>
-      <w:r>
-        <w:rPr>
-          <w:sz w:val="22"/>
-        </w:rPr>
-        <w:t xml:space="preserve">  para que ambos sets mantengan la misma proporción de riesgo.</w:t>
-      </w:r>
-    </w:p>
-    <w:p>
-      <w:r>
-        <w:rPr>
-          <w:sz w:val="22"/>
-        </w:rPr>
-        <w:t>• ESCALADO: StandardScaler dentro de un Pipeline para LR (sensible a</w:t>
-      </w:r>
-    </w:p>
-    <w:p>
-      <w:r>
-        <w:rPr>
-          <w:sz w:val="22"/>
-        </w:rPr>
-        <w:t xml:space="preserve">  escala). RF no lo necesita.</w:t>
-      </w:r>
-    </w:p>
-    <w:p>
-      <w:r>
-        <w:rPr>
-          <w:sz w:val="22"/>
-        </w:rPr>
-        <w:t>• ENCODING: no aplica — todas las features son numéricas.</w:t>
-      </w:r>
-    </w:p>
-    <w:p>
-      <w:r>
-        <w:rPr>
-          <w:sz w:val="22"/>
-        </w:rPr>
-        <w:t>• SEMILLA: random_state = 42 para reproducibilidad.</w:t>
-      </w:r>
-    </w:p>
-    <w:p>
-      <w:r>
-        <w:rPr>
-          <w:sz w:val="22"/>
-        </w:rPr>
-        <w:t>• EXAM_SCORE EXCLUIDO: para evitar data leakage (es lo que se predice).</w:t>
+        <w:t>INDICATIVO, no decisorio.</w:t>
       </w:r>
     </w:p>
     <w:p>
@@ -1581,7 +1875,7 @@
         <w:rPr>
           <w:color w:val="2C3E50"/>
         </w:rPr>
-        <w:t>Evaluación</w:t>
+        <w:t>Cómo combinar varios scores para una decisión concreta</w:t>
       </w:r>
     </w:p>
     <w:p>
@@ -1589,7 +1883,7 @@
         <w:rPr>
           <w:sz w:val="22"/>
         </w:rPr>
-        <w:t>• ¿Qué métrica es la más adecuada para este caso?</w:t>
+        <w:t>Distintos scores cuentan historias distintas del MISMO estudiante:</w:t>
       </w:r>
     </w:p>
     <w:p/>
@@ -1598,7 +1892,7 @@
         <w:rPr>
           <w:sz w:val="22"/>
         </w:rPr>
-        <w:t>• ¿Es más grave un falso positivo o un falso negativo?</w:t>
+        <w:t>• riesgo alto + potencial alto         → prioridad máxima de tutoría (ROI alto)</w:t>
       </w:r>
     </w:p>
     <w:p/>
@@ -1607,7 +1901,137 @@
         <w:rPr>
           <w:sz w:val="22"/>
         </w:rPr>
-        <w:t>• ¿El score es estable ante pequeños cambios en los datos?</w:t>
+        <w:t>• riesgo alto + engagement bajo        → primero llamado de atención por</w:t>
+      </w:r>
+    </w:p>
+    <w:p>
+      <w:r>
+        <w:rPr>
+          <w:sz w:val="22"/>
+        </w:rPr>
+        <w:t xml:space="preserve">                                         compromiso, antes que tutoría académica</w:t>
+      </w:r>
+    </w:p>
+    <w:p/>
+    <w:p>
+      <w:r>
+        <w:rPr>
+          <w:sz w:val="22"/>
+        </w:rPr>
+        <w:t>• riesgo alto + eficiencia baja        → tutoría enfocada en MÉTODO de estudio,</w:t>
+      </w:r>
+    </w:p>
+    <w:p>
+      <w:r>
+        <w:rPr>
+          <w:sz w:val="22"/>
+        </w:rPr>
+        <w:t xml:space="preserve">                                         no en contenido</w:t>
+      </w:r>
+    </w:p>
+    <w:p/>
+    <w:p>
+      <w:r>
+        <w:rPr>
+          <w:sz w:val="22"/>
+        </w:rPr>
+        <w:t>• score_anomalia alto                  → caso atípico que requiere REVISIÓN</w:t>
+      </w:r>
+    </w:p>
+    <w:p>
+      <w:r>
+        <w:rPr>
+          <w:sz w:val="22"/>
+        </w:rPr>
+        <w:t xml:space="preserve">                                         HUMANA (problema personal, ansiedad</w:t>
+      </w:r>
+    </w:p>
+    <w:p>
+      <w:r>
+        <w:rPr>
+          <w:sz w:val="22"/>
+        </w:rPr>
+        <w:t xml:space="preserve">                                         de examen, error de datos)</w:t>
+      </w:r>
+    </w:p>
+    <w:p/>
+    <w:p>
+      <w:r>
+        <w:rPr>
+          <w:sz w:val="22"/>
+        </w:rPr>
+        <w:t>• score_habitos bajo                   → charla de bienestar antes que más</w:t>
+      </w:r>
+    </w:p>
+    <w:p>
+      <w:r>
+        <w:rPr>
+          <w:sz w:val="22"/>
+        </w:rPr>
+        <w:t xml:space="preserve">                                         horas de estudio (riesgo de burnout)</w:t>
+      </w:r>
+    </w:p>
+    <w:p/>
+    <w:p>
+      <w:r>
+        <w:rPr>
+          <w:sz w:val="22"/>
+        </w:rPr>
+        <w:t>• score_progreso alto                  → reconocer mejora aunque la nota</w:t>
+      </w:r>
+    </w:p>
+    <w:p>
+      <w:r>
+        <w:rPr>
+          <w:sz w:val="22"/>
+        </w:rPr>
+        <w:t xml:space="preserve">                                         actual no sea alta — refuerza motivación</w:t>
+      </w:r>
+    </w:p>
+    <w:p/>
+    <w:p>
+      <w:r>
+        <w:rPr>
+          <w:sz w:val="22"/>
+        </w:rPr>
+        <w:t>• score_desercion alto                 → activar plan de retención: contacto</w:t>
+      </w:r>
+    </w:p>
+    <w:p>
+      <w:r>
+        <w:rPr>
+          <w:sz w:val="22"/>
+        </w:rPr>
+        <w:t xml:space="preserve">                                         coordinador, tutor de carrera, posible</w:t>
+      </w:r>
+    </w:p>
+    <w:p>
+      <w:r>
+        <w:rPr>
+          <w:sz w:val="22"/>
+        </w:rPr>
+        <w:t xml:space="preserve">                                         entrevista con bienestar estudiantil.</w:t>
+      </w:r>
+    </w:p>
+    <w:p>
+      <w:r>
+        <w:rPr>
+          <w:sz w:val="22"/>
+        </w:rPr>
+        <w:t xml:space="preserve">                                         RECORDAR: es proxy, no decisión final</w:t>
+      </w:r>
+    </w:p>
+    <w:p>
+      <w:pPr>
+        <w:pStyle w:val="Heading1"/>
+      </w:pPr>
+      <w:r>
+        <w:rPr>
+          <w:color w:val="2C3E50"/>
+        </w:rPr>
+        <w:t>Cómo se calcula cada score</w:t>
+        <w:br/>
+        <w:t>(11 fórmulas — una por página)</w:t>
       </w:r>
     </w:p>
     <w:p>
@@ -1618,1775 +2042,7 @@
         <w:rPr>
           <w:color w:val="2C3E50"/>
         </w:rPr>
-        <w:t>Respuestas — Evaluación</w:t>
-      </w:r>
-    </w:p>
-    <w:p>
-      <w:r>
-        <w:rPr>
-          <w:sz w:val="22"/>
-        </w:rPr>
-        <w:t>¿QUÉ MÉTRICA ES LA MÁS ADECUADA PARA ESTE CASO?</w:t>
-      </w:r>
-    </w:p>
-    <w:p>
-      <w:r>
-        <w:rPr>
-          <w:sz w:val="22"/>
-        </w:rPr>
-        <w:t>Hay dos lecturas complementarias:</w:t>
-      </w:r>
-    </w:p>
-    <w:p>
-      <w:r>
-        <w:rPr>
-          <w:sz w:val="22"/>
-        </w:rPr>
-        <w:t>• AUC-ROC: evalúa la calidad del RANKING completo, independiente del</w:t>
-      </w:r>
-    </w:p>
-    <w:p>
-      <w:r>
-        <w:rPr>
-          <w:sz w:val="22"/>
-        </w:rPr>
-        <w:t xml:space="preserve">  umbral. Útil porque el score se puede leer a distintos cortes según</w:t>
-      </w:r>
-    </w:p>
-    <w:p>
-      <w:r>
-        <w:rPr>
-          <w:sz w:val="22"/>
-        </w:rPr>
-        <w:t xml:space="preserve">  la capacidad operativa de la cátedra.</w:t>
-      </w:r>
-    </w:p>
-    <w:p>
-      <w:r>
-        <w:rPr>
-          <w:sz w:val="22"/>
-        </w:rPr>
-        <w:t>• RECALL sobre la clase positiva (riesgo): para el umbral elegido,</w:t>
-      </w:r>
-    </w:p>
-    <w:p>
-      <w:r>
-        <w:rPr>
-          <w:sz w:val="22"/>
-        </w:rPr>
-        <w:t xml:space="preserve">  importa cuántos casos de riesgo real se detectan. Un recall del 70-80 %</w:t>
-      </w:r>
-    </w:p>
-    <w:p>
-      <w:r>
-        <w:rPr>
-          <w:sz w:val="22"/>
-        </w:rPr>
-        <w:t xml:space="preserve">  es el objetivo operativo.</w:t>
-      </w:r>
-    </w:p>
-    <w:p>
-      <w:r>
-        <w:rPr>
-          <w:sz w:val="22"/>
-        </w:rPr>
-        <w:t>Accuracy NO es la mejor porque la clase está desbalanceada (~25 % positivos):</w:t>
-      </w:r>
-    </w:p>
-    <w:p>
-      <w:r>
-        <w:rPr>
-          <w:sz w:val="22"/>
-        </w:rPr>
-        <w:t>predecir 'siempre 0' daría 75 % accuracy y sería inútil.</w:t>
-      </w:r>
-    </w:p>
-    <w:p/>
-    <w:p>
-      <w:r>
-        <w:rPr>
-          <w:sz w:val="22"/>
-        </w:rPr>
-        <w:t>¿ES MÁS GRAVE UN FALSO POSITIVO O UN FALSO NEGATIVO?</w:t>
-      </w:r>
-    </w:p>
-    <w:p>
-      <w:r>
-        <w:rPr>
-          <w:sz w:val="22"/>
-        </w:rPr>
-        <w:t>FALSO NEGATIVO es claramente más grave en este dominio:</w:t>
-      </w:r>
-    </w:p>
-    <w:p>
-      <w:r>
-        <w:rPr>
-          <w:sz w:val="22"/>
-        </w:rPr>
-        <w:t>• FN: el score dice 'sin riesgo' y el alumno termina desaprobando.</w:t>
-      </w:r>
-    </w:p>
-    <w:p>
-      <w:r>
-        <w:rPr>
-          <w:sz w:val="22"/>
-        </w:rPr>
-        <w:t xml:space="preserve">  Costo: oportunidad perdida de ayudar; impacto académico real.</w:t>
-      </w:r>
-    </w:p>
-    <w:p>
-      <w:r>
-        <w:rPr>
-          <w:sz w:val="22"/>
-        </w:rPr>
-        <w:t>• FP: el score dice 'riesgo' y el alumno aprueba.</w:t>
-      </w:r>
-    </w:p>
-    <w:p>
-      <w:r>
-        <w:rPr>
-          <w:sz w:val="22"/>
-        </w:rPr>
-        <w:t xml:space="preserve">  Costo: una entrevista innecesaria del tutor (bajo, reversible).</w:t>
-      </w:r>
-    </w:p>
-    <w:p>
-      <w:r>
-        <w:rPr>
-          <w:sz w:val="22"/>
-        </w:rPr>
-        <w:t>Por eso se prioriza RECALL sobre precision al elegir el umbral.</w:t>
-      </w:r>
-    </w:p>
-    <w:p/>
-    <w:p>
-      <w:r>
-        <w:rPr>
-          <w:sz w:val="22"/>
-        </w:rPr>
-        <w:t>¿EL SCORE ES ESTABLE ANTE PEQUEÑOS CAMBIOS EN LOS DATOS?</w:t>
-      </w:r>
-    </w:p>
-    <w:p>
-      <w:r>
-        <w:rPr>
-          <w:sz w:val="22"/>
-        </w:rPr>
-        <w:t>Indicadores de estabilidad observados:</w:t>
-      </w:r>
-    </w:p>
-    <w:p>
-      <w:r>
-        <w:rPr>
-          <w:sz w:val="22"/>
-        </w:rPr>
-        <w:t>• AUC en CV (5 folds, train) ≈ AUC en test → no hay sobreajuste fuerte.</w:t>
-      </w:r>
-    </w:p>
-    <w:p>
-      <w:r>
-        <w:rPr>
-          <w:sz w:val="22"/>
-        </w:rPr>
-        <w:t>• Score por reglas y score por modelo correlacionan fuertemente pese a</w:t>
-      </w:r>
-    </w:p>
-    <w:p>
-      <w:r>
-        <w:rPr>
-          <w:sz w:val="22"/>
-        </w:rPr>
-        <w:t xml:space="preserve">  construirse de forma totalmente distinta → señal consistente.</w:t>
-      </w:r>
-    </w:p>
-    <w:p>
-      <w:r>
-        <w:rPr>
-          <w:sz w:val="22"/>
-        </w:rPr>
-        <w:t>• La tasa real de bajo desempeño crece monotónicamente con el nivel.</w:t>
-      </w:r>
-    </w:p>
-    <w:p>
-      <w:r>
-        <w:rPr>
-          <w:sz w:val="22"/>
-        </w:rPr>
-        <w:t>Limitación: n = 200 es chico. Con otra cohorte podría haber variación,</w:t>
-      </w:r>
-    </w:p>
-    <w:p>
-      <w:r>
-        <w:rPr>
-          <w:sz w:val="22"/>
-        </w:rPr>
-        <w:t>por eso se recomienda recalibrar el umbral en cada cuatrimestre.</w:t>
-      </w:r>
-    </w:p>
-    <w:p>
-      <w:pPr>
-        <w:pStyle w:val="Heading2"/>
-      </w:pPr>
-      <w:r>
-        <w:rPr>
-          <w:color w:val="2C3E50"/>
-        </w:rPr>
-        <w:t>Ética, sesgos y explicabilidad</w:t>
-      </w:r>
-    </w:p>
-    <w:p>
-      <w:r>
-        <w:rPr>
-          <w:sz w:val="22"/>
-        </w:rPr>
-        <w:t>• ¿El dataset puede contener sesgos que afecten el score?</w:t>
-      </w:r>
-    </w:p>
-    <w:p/>
-    <w:p>
-      <w:r>
-        <w:rPr>
-          <w:sz w:val="22"/>
-        </w:rPr>
-        <w:t>• ¿Cómo se podría explicar el score a una persona no técnica?</w:t>
-      </w:r>
-    </w:p>
-    <w:p/>
-    <w:p>
-      <w:r>
-        <w:rPr>
-          <w:sz w:val="22"/>
-        </w:rPr>
-        <w:t>• ¿Qué controles deberían existir antes de implementarlo en producción?</w:t>
-      </w:r>
-    </w:p>
-    <w:p>
-      <w:pPr>
-        <w:pStyle w:val="Heading2"/>
-      </w:pPr>
-      <w:r>
-        <w:rPr>
-          <w:color w:val="2C3E50"/>
-        </w:rPr>
-        <w:t>Respuestas — Ética, sesgos y explicabilidad</w:t>
-      </w:r>
-    </w:p>
-    <w:p>
-      <w:r>
-        <w:rPr>
-          <w:sz w:val="22"/>
-        </w:rPr>
-        <w:t>¿EL DATASET PUEDE CONTENER SESGOS QUE AFECTEN EL SCORE?</w:t>
-      </w:r>
-    </w:p>
-    <w:p>
-      <w:r>
-        <w:rPr>
-          <w:sz w:val="22"/>
-        </w:rPr>
-        <w:t>Sí, varios:</w:t>
-      </w:r>
-    </w:p>
-    <w:p>
-      <w:r>
-        <w:rPr>
-          <w:sz w:val="22"/>
-        </w:rPr>
-        <w:t>• Variables autodeclaradas: hours_studied y sleep_hours dependen de la</w:t>
-      </w:r>
-    </w:p>
-    <w:p>
-      <w:r>
-        <w:rPr>
-          <w:sz w:val="22"/>
-        </w:rPr>
-        <w:t xml:space="preserve">  honestidad del estudiante (sesgo de respuesta).</w:t>
-      </w:r>
-    </w:p>
-    <w:p>
-      <w:r>
-        <w:rPr>
-          <w:sz w:val="22"/>
-        </w:rPr>
-        <w:t>• Sesgo de selección: solo aparecen alumnos que llegaron al examen;</w:t>
-      </w:r>
-    </w:p>
-    <w:p>
-      <w:r>
-        <w:rPr>
-          <w:sz w:val="22"/>
-        </w:rPr>
-        <w:t xml:space="preserve">  los que abandonaron antes no están representados.</w:t>
-      </w:r>
-    </w:p>
-    <w:p>
-      <w:r>
-        <w:rPr>
-          <w:sz w:val="22"/>
-        </w:rPr>
-        <w:t>• Sesgo de etiquetado: si en cohortes previas hubo intervenciones,</w:t>
-      </w:r>
-    </w:p>
-    <w:p>
-      <w:r>
-        <w:rPr>
-          <w:sz w:val="22"/>
-        </w:rPr>
-        <w:t xml:space="preserve">  el modelo aprende a sub-detectar a quienes ya recibieron ayuda.</w:t>
-      </w:r>
-    </w:p>
-    <w:p>
-      <w:r>
-        <w:rPr>
-          <w:sz w:val="22"/>
-        </w:rPr>
-        <w:t>• Variables ausentes pero relevantes: nivel socioeconómico, trabajo en</w:t>
-      </w:r>
-    </w:p>
-    <w:p>
-      <w:r>
-        <w:rPr>
-          <w:sz w:val="22"/>
-        </w:rPr>
-        <w:t xml:space="preserve">  paralelo, distancia al campus — pueden correlacionar con las features</w:t>
-      </w:r>
-    </w:p>
-    <w:p>
-      <w:r>
-        <w:rPr>
-          <w:sz w:val="22"/>
-        </w:rPr>
-        <w:t xml:space="preserve">  e introducir sesgo indirecto.</w:t>
-      </w:r>
-    </w:p>
-    <w:p/>
-    <w:p>
-      <w:r>
-        <w:rPr>
-          <w:sz w:val="22"/>
-        </w:rPr>
-        <w:t>¿CÓMO SE PODRÍA EXPLICAR EL SCORE A UNA PERSONA NO TÉCNICA?</w:t>
-      </w:r>
-    </w:p>
-    <w:p>
-      <w:r>
-        <w:rPr>
-          <w:sz w:val="22"/>
-        </w:rPr>
-        <w:t>Usando lenguaje natural y los valores propios del alumno:</w:t>
-      </w:r>
-    </w:p>
-    <w:p>
-      <w:r>
-        <w:rPr>
-          <w:sz w:val="22"/>
-        </w:rPr>
-        <w:t xml:space="preserve">  'Tu score combina cuatro señales: cuánto estudiás (40 %), tu</w:t>
-      </w:r>
-    </w:p>
-    <w:p>
-      <w:r>
-        <w:rPr>
-          <w:sz w:val="22"/>
-        </w:rPr>
-        <w:t xml:space="preserve">   trayectoria previa (30 %), tu asistencia (20 %) y tus horas de</w:t>
-      </w:r>
-    </w:p>
-    <w:p>
-      <w:r>
-        <w:rPr>
-          <w:sz w:val="22"/>
-        </w:rPr>
-        <w:t xml:space="preserve">   sueño (10 %). En tu caso, estudiás X horas y asistís al Y %, eso</w:t>
-      </w:r>
-    </w:p>
-    <w:p>
-      <w:r>
-        <w:rPr>
-          <w:sz w:val="22"/>
-        </w:rPr>
-        <w:t xml:space="preserve">   te ubica en nivel Z. Si aumentás horas de estudio y asistencia</w:t>
-      </w:r>
-    </w:p>
-    <w:p>
-      <w:r>
-        <w:rPr>
-          <w:sz w:val="22"/>
-        </w:rPr>
-        <w:t xml:space="preserve">   (las dos variables más controlables a corto plazo), el score baja.'</w:t>
-      </w:r>
-    </w:p>
-    <w:p>
-      <w:r>
-        <w:rPr>
-          <w:sz w:val="22"/>
-        </w:rPr>
-        <w:t>Cada estudiante debería poder pedir este detalle (derecho a la</w:t>
-      </w:r>
-    </w:p>
-    <w:p>
-      <w:r>
-        <w:rPr>
-          <w:sz w:val="22"/>
-        </w:rPr>
-        <w:t>explicación).</w:t>
-      </w:r>
-    </w:p>
-    <w:p/>
-    <w:p>
-      <w:r>
-        <w:rPr>
-          <w:sz w:val="22"/>
-        </w:rPr>
-        <w:t>¿QUÉ CONTROLES DEBERÍAN EXISTIR ANTES DE IMPLEMENTARLO?</w:t>
-      </w:r>
-    </w:p>
-    <w:p>
-      <w:r>
-        <w:rPr>
-          <w:sz w:val="22"/>
-        </w:rPr>
-        <w:t>• TÉCNICOS: validación con otra cohorte, monitoreo de drift, pruebas</w:t>
-      </w:r>
-    </w:p>
-    <w:p>
-      <w:r>
-        <w:rPr>
-          <w:sz w:val="22"/>
-        </w:rPr>
-        <w:t xml:space="preserve">  de fairness por carrera / sede / turno, recalibración periódica.</w:t>
-      </w:r>
-    </w:p>
-    <w:p>
-      <w:r>
-        <w:rPr>
-          <w:sz w:val="22"/>
-        </w:rPr>
-        <w:t>• HUMANOS: el score ASISTE, NO DECIDE — todo caso pasa por un tutor</w:t>
-      </w:r>
-    </w:p>
-    <w:p>
-      <w:r>
-        <w:rPr>
-          <w:sz w:val="22"/>
-        </w:rPr>
-        <w:t xml:space="preserve">  que puede sobrescribir el nivel. Auditoría manual de 'Crítico'.</w:t>
-      </w:r>
-    </w:p>
-    <w:p>
-      <w:r>
-        <w:rPr>
-          <w:sz w:val="22"/>
-        </w:rPr>
-        <w:t>• ÉTICOS Y NORMATIVOS: consentimiento informado, derecho a no</w:t>
-      </w:r>
-    </w:p>
-    <w:p>
-      <w:r>
-        <w:rPr>
-          <w:sz w:val="22"/>
-        </w:rPr>
-        <w:t xml:space="preserve">  participar, transparencia sobre qué variables se usan, vía formal</w:t>
-      </w:r>
-    </w:p>
-    <w:p>
-      <w:r>
-        <w:rPr>
-          <w:sz w:val="22"/>
-        </w:rPr>
-        <w:t xml:space="preserve">  para impugnar el nivel asignado.</w:t>
-      </w:r>
-    </w:p>
-    <w:p>
-      <w:r>
-        <w:rPr>
-          <w:sz w:val="22"/>
-        </w:rPr>
-        <w:t>• EXCLUSIONES EXPLÍCITAS: nunca incorporar género, edad, etnia,</w:t>
-      </w:r>
-    </w:p>
-    <w:p>
-      <w:r>
-        <w:rPr>
-          <w:sz w:val="22"/>
-        </w:rPr>
-        <w:t xml:space="preserve">  nacionalidad ni nivel socioeconómico como features.</w:t>
-      </w:r>
-    </w:p>
-    <w:p>
-      <w:pPr>
-        <w:pStyle w:val="Heading1"/>
-      </w:pPr>
-      <w:r>
-        <w:rPr>
-          <w:color w:val="2C3E50"/>
-        </w:rPr>
-        <w:t>1. Definición del problema</w:t>
-      </w:r>
-    </w:p>
-    <w:p>
-      <w:pPr>
-        <w:pStyle w:val="Heading2"/>
-      </w:pPr>
-      <w:r>
-        <w:rPr>
-          <w:color w:val="2C3E50"/>
-        </w:rPr>
-        <w:t>Definición del problema</w:t>
-      </w:r>
-    </w:p>
-    <w:p>
-      <w:r>
-        <w:rPr>
-          <w:sz w:val="22"/>
-        </w:rPr>
-        <w:t>DECISIÓN A APOYAR</w:t>
-      </w:r>
-    </w:p>
-    <w:p>
-      <w:r>
-        <w:rPr>
-          <w:sz w:val="22"/>
-        </w:rPr>
-        <w:t>Detectar antes del examen final qué estudiantes tienen mayor probabilidad de bajo</w:t>
-      </w:r>
-    </w:p>
-    <w:p>
-      <w:r>
-        <w:rPr>
-          <w:sz w:val="22"/>
-        </w:rPr>
-        <w:t>desempeño, para que la cátedra pueda intervenir (tutorías, recuperatorios, seguimiento).</w:t>
-      </w:r>
-    </w:p>
-    <w:p/>
-    <w:p>
-      <w:r>
-        <w:rPr>
-          <w:sz w:val="22"/>
-        </w:rPr>
-        <w:t>UNIDAD DE ANÁLISIS</w:t>
-      </w:r>
-    </w:p>
-    <w:p>
-      <w:r>
-        <w:rPr>
-          <w:sz w:val="22"/>
-        </w:rPr>
-        <w:t>Un estudiante (1 fila = 1 estudiante = 1 score).</w:t>
-      </w:r>
-    </w:p>
-    <w:p/>
-    <w:p>
-      <w:r>
-        <w:rPr>
-          <w:sz w:val="22"/>
-        </w:rPr>
-        <w:t>QUÉ SIGNIFICA EL SCORE</w:t>
-      </w:r>
-    </w:p>
-    <w:p>
-      <w:r>
-        <w:rPr>
-          <w:sz w:val="22"/>
-        </w:rPr>
-        <w:t>Riesgo de bajo desempeño académico en el examen. Score alto = mayor riesgo (negativo).</w:t>
-      </w:r>
-    </w:p>
-    <w:p>
-      <w:r>
-        <w:rPr>
-          <w:sz w:val="22"/>
-        </w:rPr>
-        <w:t>Convención coherente con scoring crediticio de riesgo.</w:t>
-      </w:r>
-    </w:p>
-    <w:p/>
-    <w:p>
-      <w:r>
-        <w:rPr>
-          <w:sz w:val="22"/>
-        </w:rPr>
-        <w:t>QUIÉN LO USA Y CUÁNDO</w:t>
-      </w:r>
-    </w:p>
-    <w:p>
-      <w:r>
-        <w:rPr>
-          <w:sz w:val="22"/>
-        </w:rPr>
-        <w:t>Tutores, coordinador académico y docente del curso, al inicio o mitad del cuatrimestre,</w:t>
-      </w:r>
-    </w:p>
-    <w:p>
-      <w:r>
-        <w:rPr>
-          <w:sz w:val="22"/>
-        </w:rPr>
-        <w:t>ANTES del examen final. Por eso 'exam_score' no se usa como variable predictora</w:t>
-      </w:r>
-    </w:p>
-    <w:p>
-      <w:r>
-        <w:rPr>
-          <w:sz w:val="22"/>
-        </w:rPr>
-        <w:t>(sería data leakage: la decisión la tomamos antes de conocer la nota).</w:t>
-      </w:r>
-    </w:p>
-    <w:p/>
-    <w:p>
-      <w:r>
-        <w:rPr>
-          <w:sz w:val="22"/>
-        </w:rPr>
-        <w:t>SCORING vs CLASIFICACIÓN vs PREDICCIÓN</w:t>
-      </w:r>
-    </w:p>
-    <w:p>
-      <w:r>
-        <w:rPr>
-          <w:sz w:val="22"/>
-        </w:rPr>
-        <w:t>• Predicción: estima el valor de exam_score (regresión).</w:t>
-      </w:r>
-    </w:p>
-    <w:p>
-      <w:r>
-        <w:rPr>
-          <w:sz w:val="22"/>
-        </w:rPr>
-        <w:t>• Clasificación: asigna 0 o 1 (¿desaprobará o no?).</w:t>
-      </w:r>
-    </w:p>
-    <w:p>
-      <w:r>
-        <w:rPr>
-          <w:sz w:val="22"/>
-        </w:rPr>
-        <w:t>• Scoring: ordena a los estudiantes en 0-100 para priorizar intervenciones.</w:t>
-      </w:r>
-    </w:p>
-    <w:p>
-      <w:pPr>
-        <w:pStyle w:val="Heading1"/>
-      </w:pPr>
-      <w:r>
-        <w:rPr>
-          <w:color w:val="2C3E50"/>
-        </w:rPr>
-        <w:t>2. Exploración del dataset</w:t>
-      </w:r>
-    </w:p>
-    <w:p>
-      <w:pPr>
-        <w:pStyle w:val="Heading2"/>
-      </w:pPr>
-      <w:r>
-        <w:rPr>
-          <w:color w:val="2C3E50"/>
-        </w:rPr>
-        <w:t>Hallazgos del EDA</w:t>
-      </w:r>
-    </w:p>
-    <w:p>
-      <w:r>
-        <w:rPr>
-          <w:sz w:val="22"/>
-        </w:rPr>
-        <w:t>• 200 estudiantes, sin nulos ni duplicados → no requiere imputación.</w:t>
-      </w:r>
-    </w:p>
-    <w:p/>
-    <w:p>
-      <w:r>
-        <w:rPr>
-          <w:sz w:val="22"/>
-        </w:rPr>
-        <w:t>• exam_score va de 17.1 a 51.3 —</w:t>
-      </w:r>
-    </w:p>
-    <w:p>
-      <w:r>
-        <w:rPr>
-          <w:sz w:val="22"/>
-        </w:rPr>
-        <w:t xml:space="preserve">  no es un 0-100 clásico. Por eso no aplica el umbral de 60 del enunciado:</w:t>
-      </w:r>
-    </w:p>
-    <w:p>
-      <w:r>
-        <w:rPr>
-          <w:sz w:val="22"/>
-        </w:rPr>
-        <w:t xml:space="preserve">  dejaría al 100% de los estudiantes como 'riesgo'.</w:t>
-      </w:r>
-    </w:p>
-    <w:p/>
-    <w:p>
-      <w:r>
-        <w:rPr>
-          <w:sz w:val="22"/>
-        </w:rPr>
-        <w:t>• previous_scores está en escala 40-95 (parece promedio académico previo 0-100).</w:t>
-      </w:r>
-    </w:p>
-    <w:p/>
-    <w:p>
-      <w:r>
-        <w:rPr>
-          <w:sz w:val="22"/>
-        </w:rPr>
-        <w:t>• hours_studied, sleep_hours y attendance_percent están en rangos plausibles.</w:t>
-      </w:r>
-    </w:p>
-    <w:p/>
-    <w:p>
-      <w:r>
-        <w:rPr>
-          <w:sz w:val="22"/>
-        </w:rPr>
-        <w:t>• Predictor más fuerte: hours_studied (r = 0.78 con exam_score).</w:t>
-      </w:r>
-    </w:p>
-    <w:p>
-      <w:r>
-        <w:rPr>
-          <w:sz w:val="22"/>
-        </w:rPr>
-        <w:t xml:space="preserve">  Le sigue previous_scores (r = 0.43), después attendance (0.23) y sleep_hours (0.19).</w:t>
-      </w:r>
-    </w:p>
-    <w:p>
-      <w:pPr>
-        <w:pStyle w:val="Heading1"/>
-      </w:pPr>
-      <w:r>
-        <w:rPr>
-          <w:color w:val="2C3E50"/>
-        </w:rPr>
-        <w:t>3. Variable objetivo</w:t>
-      </w:r>
-    </w:p>
-    <w:p>
-      <w:pPr>
-        <w:pStyle w:val="Heading2"/>
-      </w:pPr>
-      <w:r>
-        <w:rPr>
-          <w:color w:val="2C3E50"/>
-        </w:rPr>
-        <w:t>Definición de riesgo_bajo_desempeno</w:t>
-      </w:r>
-    </w:p>
-    <w:p>
-      <w:r>
-        <w:rPr>
-          <w:sz w:val="22"/>
-        </w:rPr>
-        <w:t>DECISIÓN</w:t>
-      </w:r>
-    </w:p>
-    <w:p>
-      <w:r>
-        <w:rPr>
-          <w:sz w:val="22"/>
-        </w:rPr>
-        <w:t>Como exam_score no está en escala 0-100 estándar, el umbral se define</w:t>
-      </w:r>
-    </w:p>
-    <w:p>
-      <w:r>
-        <w:rPr>
-          <w:sz w:val="22"/>
-        </w:rPr>
-        <w:t>usando el cuartil inferior de la propia distribución: el 25 % de estudiantes</w:t>
-      </w:r>
-    </w:p>
-    <w:p>
-      <w:r>
-        <w:rPr>
-          <w:sz w:val="22"/>
-        </w:rPr>
-        <w:t>con peor nota se considera 'bajo desempeño'.</w:t>
-      </w:r>
-    </w:p>
-    <w:p/>
-    <w:p>
-      <w:r>
-        <w:rPr>
-          <w:sz w:val="22"/>
-        </w:rPr>
-        <w:t>REGLA</w:t>
-      </w:r>
-    </w:p>
-    <w:p>
-      <w:r>
-        <w:rPr>
-          <w:sz w:val="22"/>
-        </w:rPr>
-        <w:t xml:space="preserve">  riesgo_bajo_desempeno = 1   si exam_score &lt; 29.50</w:t>
-      </w:r>
-    </w:p>
-    <w:p>
-      <w:r>
-        <w:rPr>
-          <w:sz w:val="22"/>
-        </w:rPr>
-        <w:t xml:space="preserve">  riesgo_bajo_desempeno = 0   en caso contrario</w:t>
-      </w:r>
-    </w:p>
-    <w:p/>
-    <w:p>
-      <w:r>
-        <w:rPr>
-          <w:sz w:val="22"/>
-        </w:rPr>
-        <w:t>DISTRIBUCIÓN OBSERVADA</w:t>
-      </w:r>
-    </w:p>
-    <w:p>
-      <w:r>
-        <w:rPr>
-          <w:sz w:val="22"/>
-        </w:rPr>
-        <w:t xml:space="preserve">  • Clase 0 (sin riesgo): 75.5 %</w:t>
-      </w:r>
-    </w:p>
-    <w:p>
-      <w:r>
-        <w:rPr>
-          <w:sz w:val="22"/>
-        </w:rPr>
-        <w:t xml:space="preserve">  • Clase 1 (riesgo):     24.5 %</w:t>
-      </w:r>
-    </w:p>
-    <w:p/>
-    <w:p>
-      <w:r>
-        <w:rPr>
-          <w:sz w:val="22"/>
-        </w:rPr>
-        <w:t>Es un criterio relativo, transparente y reproducible. En otra cohorte habría</w:t>
-      </w:r>
-    </w:p>
-    <w:p>
-      <w:r>
-        <w:rPr>
-          <w:sz w:val="22"/>
-        </w:rPr>
-        <w:t>que recalibrar el umbral.</w:t>
-      </w:r>
-    </w:p>
-    <w:p>
-      <w:pPr>
-        <w:pStyle w:val="Heading1"/>
-      </w:pPr>
-      <w:r>
-        <w:rPr>
-          <w:color w:val="2C3E50"/>
-        </w:rPr>
-        <w:t>4. Scoring por reglas</w:t>
-      </w:r>
-    </w:p>
-    <w:p>
-      <w:pPr>
-        <w:pStyle w:val="Heading1"/>
-      </w:pPr>
-      <w:r>
-        <w:rPr>
-          <w:color w:val="2C3E50"/>
-        </w:rPr>
-        <w:t>5. Niveles de riesgo y acciones</w:t>
-      </w:r>
-    </w:p>
-    <w:p>
-      <w:pPr>
-        <w:pStyle w:val="Heading2"/>
-      </w:pPr>
-      <w:r>
-        <w:rPr>
-          <w:color w:val="2C3E50"/>
-        </w:rPr>
-        <w:t>Lectura de la validación</w:t>
-      </w:r>
-    </w:p>
-    <w:p>
-      <w:r>
-        <w:rPr>
-          <w:sz w:val="22"/>
-        </w:rPr>
-        <w:t>Si el score por reglas funciona, la 'tasa de bajo desempeño' debe crecer</w:t>
-      </w:r>
-    </w:p>
-    <w:p>
-      <w:r>
-        <w:rPr>
-          <w:sz w:val="22"/>
-        </w:rPr>
-        <w:t>monotónicamente del nivel Bajo al Crítico. Es lo que se observa:</w:t>
-      </w:r>
-    </w:p>
-    <w:p/>
-    <w:p>
-      <w:r>
-        <w:rPr>
-          <w:sz w:val="22"/>
-        </w:rPr>
-        <w:t xml:space="preserve">  Bajo    →   0.0 % de los estudiantes desaprueba</w:t>
-      </w:r>
-    </w:p>
-    <w:p>
-      <w:r>
-        <w:rPr>
-          <w:sz w:val="22"/>
-        </w:rPr>
-        <w:t xml:space="preserve">  Medio   →   1.5 %</w:t>
-      </w:r>
-    </w:p>
-    <w:p>
-      <w:r>
-        <w:rPr>
-          <w:sz w:val="22"/>
-        </w:rPr>
-        <w:t xml:space="preserve">  Alto    →  34.4 %</w:t>
-      </w:r>
-    </w:p>
-    <w:p>
-      <w:r>
-        <w:rPr>
-          <w:sz w:val="22"/>
-        </w:rPr>
-        <w:t xml:space="preserve">  Crítico →  84.4 %</w:t>
-      </w:r>
-    </w:p>
-    <w:p/>
-    <w:p>
-      <w:r>
-        <w:rPr>
-          <w:sz w:val="22"/>
-        </w:rPr>
-        <w:t>El salto entre Alto y Crítico es la señal más fuerte: el score por reglas</w:t>
-      </w:r>
-    </w:p>
-    <w:p>
-      <w:r>
-        <w:rPr>
-          <w:sz w:val="22"/>
-        </w:rPr>
-        <w:t>logra concentrar el riesgo real en el extremo superior de la escala.</w:t>
-      </w:r>
-    </w:p>
-    <w:p>
-      <w:pPr>
-        <w:pStyle w:val="Heading1"/>
-      </w:pPr>
-      <w:r>
-        <w:rPr>
-          <w:color w:val="2C3E50"/>
-        </w:rPr>
-        <w:t>6. Modelo predictivo (scikit-learn)</w:t>
-      </w:r>
-    </w:p>
-    <w:p>
-      <w:pPr>
-        <w:pStyle w:val="Heading2"/>
-      </w:pPr>
-      <w:r>
-        <w:rPr>
-          <w:color w:val="2C3E50"/>
-        </w:rPr>
-        <w:t>Decisiones de modelado</w:t>
-      </w:r>
-    </w:p>
-    <w:p>
-      <w:r>
-        <w:rPr>
-          <w:sz w:val="22"/>
-        </w:rPr>
-        <w:t>TIPO DE PROBLEMA</w:t>
-      </w:r>
-    </w:p>
-    <w:p>
-      <w:r>
-        <w:rPr>
-          <w:sz w:val="22"/>
-        </w:rPr>
-        <w:t>Clasificación binaria (riesgo / no riesgo). El usuario final necesita decidir</w:t>
-      </w:r>
-    </w:p>
-    <w:p>
-      <w:r>
-        <w:rPr>
-          <w:sz w:val="22"/>
-        </w:rPr>
-        <w:t>intervenir o no — output operativo, no estimar la nota exacta.</w:t>
-      </w:r>
-    </w:p>
-    <w:p/>
-    <w:p>
-      <w:r>
-        <w:rPr>
-          <w:sz w:val="22"/>
-        </w:rPr>
-        <w:t>VARIABLES PREDICTORAS</w:t>
-      </w:r>
-    </w:p>
-    <w:p>
-      <w:r>
-        <w:rPr>
-          <w:sz w:val="22"/>
-        </w:rPr>
-        <w:t>hours_studied, sleep_hours, attendance_percent, previous_scores.</w:t>
-      </w:r>
-    </w:p>
-    <w:p>
-      <w:r>
-        <w:rPr>
-          <w:sz w:val="22"/>
-        </w:rPr>
-        <w:t>Disponibles ANTES del examen final. exam_score se excluye (data leakage).</w:t>
-      </w:r>
-    </w:p>
-    <w:p/>
-    <w:p>
-      <w:r>
-        <w:rPr>
-          <w:sz w:val="22"/>
-        </w:rPr>
-        <w:t>MODELOS COMPARADOS</w:t>
-      </w:r>
-    </w:p>
-    <w:p>
-      <w:r>
-        <w:rPr>
-          <w:sz w:val="22"/>
-        </w:rPr>
-        <w:t>• Logistic Regression: interpretable, rápido, baseline.</w:t>
-      </w:r>
-    </w:p>
-    <w:p>
-      <w:r>
-        <w:rPr>
-          <w:sz w:val="22"/>
-        </w:rPr>
-        <w:t>• Random Forest: capta no-linealidades, robusto a outliers.</w:t>
-      </w:r>
-    </w:p>
-    <w:p>
-      <w:r>
-        <w:rPr>
-          <w:sz w:val="22"/>
-        </w:rPr>
-        <w:t>Se elige el de mejor AUC en validación cruzada (5 folds).</w:t>
-      </w:r>
-    </w:p>
-    <w:p/>
-    <w:p>
-      <w:r>
-        <w:rPr>
-          <w:sz w:val="22"/>
-        </w:rPr>
-        <w:t>OTRAS DECISIONES</w:t>
-      </w:r>
-    </w:p>
-    <w:p>
-      <w:r>
-        <w:rPr>
-          <w:sz w:val="22"/>
-        </w:rPr>
-        <w:t>• train/test estratificado (clase positiva ≈ 25 %).</w:t>
-      </w:r>
-    </w:p>
-    <w:p>
-      <w:r>
-        <w:rPr>
-          <w:sz w:val="22"/>
-        </w:rPr>
-        <w:t>• StandardScaler en LR (sensible a escalas).</w:t>
-      </w:r>
-    </w:p>
-    <w:p>
-      <w:r>
-        <w:rPr>
-          <w:sz w:val="22"/>
-        </w:rPr>
-        <w:t>• Random state = 42 para reproducibilidad.</w:t>
-      </w:r>
-    </w:p>
-    <w:p>
-      <w:pPr>
-        <w:pStyle w:val="Heading1"/>
-      </w:pPr>
-      <w:r>
-        <w:rPr>
-          <w:color w:val="2C3E50"/>
-        </w:rPr>
-        <w:t>7. Comparación reglas vs modelo</w:t>
-      </w:r>
-    </w:p>
-    <w:p>
-      <w:pPr>
-        <w:pStyle w:val="Heading1"/>
-      </w:pPr>
-      <w:r>
-        <w:rPr>
-          <w:color w:val="2C3E50"/>
-        </w:rPr>
-        <w:t>8. Evaluación con métricas</w:t>
-      </w:r>
-    </w:p>
-    <w:p>
-      <w:pPr>
-        <w:pStyle w:val="Heading2"/>
-      </w:pPr>
-      <w:r>
-        <w:rPr>
-          <w:color w:val="2C3E50"/>
-        </w:rPr>
-        <w:t>Falso positivo vs falso negativo</w:t>
-      </w:r>
-    </w:p>
-    <w:p>
-      <w:r>
-        <w:rPr>
-          <w:sz w:val="22"/>
-        </w:rPr>
-        <w:t>EN ESTE PROBLEMA, EL FALSO NEGATIVO ES MÁS GRAVE</w:t>
-      </w:r>
-    </w:p>
-    <w:p/>
-    <w:p>
-      <w:r>
-        <w:rPr>
-          <w:sz w:val="22"/>
-        </w:rPr>
-        <w:t>• FALSO NEGATIVO: el score dice 'sin riesgo' pero el estudiante desaprueba.</w:t>
-      </w:r>
-    </w:p>
-    <w:p>
-      <w:r>
-        <w:rPr>
-          <w:sz w:val="22"/>
-        </w:rPr>
-        <w:t xml:space="preserve">  Costo: no recibió la intervención y termina desaprobando.</w:t>
-      </w:r>
-    </w:p>
-    <w:p/>
-    <w:p>
-      <w:r>
-        <w:rPr>
-          <w:sz w:val="22"/>
-        </w:rPr>
-        <w:t>• FALSO POSITIVO: el score dice 'riesgo' pero el estudiante aprueba.</w:t>
-      </w:r>
-    </w:p>
-    <w:p>
-      <w:r>
-        <w:rPr>
-          <w:sz w:val="22"/>
-        </w:rPr>
-        <w:t xml:space="preserve">  Costo: una entrevista innecesaria del tutor.</w:t>
-      </w:r>
-    </w:p>
-    <w:p/>
-    <w:p>
-      <w:r>
-        <w:rPr>
-          <w:sz w:val="22"/>
-        </w:rPr>
-        <w:t>→ Priorizamos RECALL sobre la clase positiva (riesgo). Para un score operativo,</w:t>
-      </w:r>
-    </w:p>
-    <w:p>
-      <w:r>
-        <w:rPr>
-          <w:sz w:val="22"/>
-        </w:rPr>
-        <w:t>fijamos un umbral que capture al menos el 70-80 % de los casos positivos.</w:t>
-      </w:r>
-    </w:p>
-    <w:p>
-      <w:pPr>
-        <w:pStyle w:val="Heading2"/>
-      </w:pPr>
-      <w:r>
-        <w:rPr>
-          <w:color w:val="2C3E50"/>
-        </w:rPr>
-        <w:t>Lectura de la matriz de confusión</w:t>
-      </w:r>
-    </w:p>
-    <w:p>
-      <w:r>
-        <w:rPr>
-          <w:sz w:val="22"/>
-        </w:rPr>
-        <w:t>En el set de test (n = 60) y con umbral operativo 50:</w:t>
-      </w:r>
-    </w:p>
-    <w:p/>
-    <w:p>
-      <w:r>
-        <w:rPr>
-          <w:sz w:val="22"/>
-        </w:rPr>
-        <w:t xml:space="preserve">  → De 15 estudiantes con riesgo real, el modelo detectó 12</w:t>
-      </w:r>
-    </w:p>
-    <w:p>
-      <w:r>
-        <w:rPr>
-          <w:sz w:val="22"/>
-        </w:rPr>
-        <w:t xml:space="preserve">    y dejó pasar 3  (recall = 80%).</w:t>
-      </w:r>
-    </w:p>
-    <w:p/>
-    <w:p>
-      <w:r>
-        <w:rPr>
-          <w:sz w:val="22"/>
-        </w:rPr>
-        <w:t xml:space="preserve">  → De 45 estudiantes sin riesgo, el modelo clasificó bien 44</w:t>
-      </w:r>
-    </w:p>
-    <w:p>
-      <w:r>
-        <w:rPr>
-          <w:sz w:val="22"/>
-        </w:rPr>
-        <w:t xml:space="preserve">    y marcó 1 como riesgo erróneamente  (specificity = 98%).</w:t>
-      </w:r>
-    </w:p>
-    <w:p/>
-    <w:p>
-      <w:r>
-        <w:rPr>
-          <w:sz w:val="22"/>
-        </w:rPr>
-        <w:t xml:space="preserve">  → De los 13 alumnos que el modelo señaló como en riesgo,</w:t>
-      </w:r>
-    </w:p>
-    <w:p>
-      <w:r>
-        <w:rPr>
-          <w:sz w:val="22"/>
-        </w:rPr>
-        <w:t xml:space="preserve">    12 efectivamente lo estaban  (precision = 92%).</w:t>
-      </w:r>
-    </w:p>
-    <w:p/>
-    <w:p>
-      <w:r>
-        <w:rPr>
-          <w:sz w:val="22"/>
-        </w:rPr>
-        <w:t>INTERPRETACIÓN OPERATIVA</w:t>
-      </w:r>
-    </w:p>
-    <w:p/>
-    <w:p>
-      <w:r>
-        <w:rPr>
-          <w:sz w:val="22"/>
-        </w:rPr>
-        <w:t>• Falsos negativos = 3  ← son los más graves: el sistema dice 'no</w:t>
-      </w:r>
-    </w:p>
-    <w:p>
-      <w:r>
-        <w:rPr>
-          <w:sz w:val="22"/>
-        </w:rPr>
-        <w:t xml:space="preserve">  hace falta intervenir' y el alumno termina desaprobando. Cada FN</w:t>
-      </w:r>
-    </w:p>
-    <w:p>
-      <w:r>
-        <w:rPr>
-          <w:sz w:val="22"/>
-        </w:rPr>
-        <w:t xml:space="preserve">  representa una oportunidad perdida de ayudar.</w:t>
-      </w:r>
-    </w:p>
-    <w:p/>
-    <w:p>
-      <w:r>
-        <w:rPr>
-          <w:sz w:val="22"/>
-        </w:rPr>
-        <w:t>• Falsos positivos = 1  ← son tolerables: solo cuestan una entrevista</w:t>
-      </w:r>
-    </w:p>
-    <w:p>
-      <w:r>
-        <w:rPr>
-          <w:sz w:val="22"/>
-        </w:rPr>
-        <w:t xml:space="preserve">  innecesaria con el tutor.</w:t>
-      </w:r>
-    </w:p>
-    <w:p/>
-    <w:p>
-      <w:r>
-        <w:rPr>
-          <w:sz w:val="22"/>
-        </w:rPr>
-        <w:t>• Si la cátedra tuviera capacidad para más casos, podría bajar el</w:t>
-      </w:r>
-    </w:p>
-    <w:p>
-      <w:r>
-        <w:rPr>
-          <w:sz w:val="22"/>
-        </w:rPr>
-        <w:t xml:space="preserve">  umbral (ej. a 40) y subir recall a costa de algo de precision.</w:t>
-      </w:r>
-    </w:p>
-    <w:p>
-      <w:r>
-        <w:rPr>
-          <w:sz w:val="22"/>
-        </w:rPr>
-        <w:t xml:space="preserve">  Si la capacidad fuera muy escasa, subir el umbral (ej. a 60) elevaría</w:t>
-      </w:r>
-    </w:p>
-    <w:p>
-      <w:r>
-        <w:rPr>
-          <w:sz w:val="22"/>
-        </w:rPr>
-        <w:t xml:space="preserve">  precision pero dejaría más alumnos en riesgo sin ayuda.</w:t>
-      </w:r>
-    </w:p>
-    <w:p/>
-    <w:p>
-      <w:r>
-        <w:rPr>
-          <w:sz w:val="22"/>
-        </w:rPr>
-        <w:t>La tabla de la próxima página muestra esa misma matriz pero a 4 umbrales,</w:t>
-      </w:r>
-    </w:p>
-    <w:p>
-      <w:r>
-        <w:rPr>
-          <w:sz w:val="22"/>
-        </w:rPr>
-        <w:t>para apoyar la decisión del corte operativo.</w:t>
-      </w:r>
-    </w:p>
-    <w:p>
-      <w:pPr>
-        <w:pStyle w:val="Heading1"/>
-      </w:pPr>
-      <w:r>
-        <w:rPr>
-          <w:color w:val="2C3E50"/>
-        </w:rPr>
-        <w:t>9. Casos individuales</w:t>
-      </w:r>
-    </w:p>
-    <w:p>
-      <w:pPr>
-        <w:pStyle w:val="Heading2"/>
-      </w:pPr>
-      <w:r>
-        <w:rPr>
-          <w:color w:val="2C3E50"/>
-        </w:rPr>
-        <w:t>Cómo se explica el score a un usuario no técnico</w:t>
-      </w:r>
-    </w:p>
-    <w:p>
-      <w:r>
-        <w:rPr>
-          <w:sz w:val="22"/>
-        </w:rPr>
-        <w:t>EJEMPLO — caso crítico</w:t>
-      </w:r>
-    </w:p>
-    <w:p/>
-    <w:p>
-      <w:r>
-        <w:rPr>
-          <w:sz w:val="22"/>
-        </w:rPr>
-        <w:t>Estudiante S125 recibió un score alto porque combina:</w:t>
-      </w:r>
-    </w:p>
-    <w:p>
-      <w:r>
-        <w:rPr>
-          <w:sz w:val="22"/>
-        </w:rPr>
-        <w:t xml:space="preserve">  • 1.0 horas de estudio (rango bajo: ≤ 2 hs)</w:t>
-      </w:r>
-    </w:p>
-    <w:p>
-      <w:r>
-        <w:rPr>
-          <w:sz w:val="22"/>
-        </w:rPr>
-        <w:t xml:space="preserve">  • 54 en desempeño previo (rango bajo: ≤ 50)</w:t>
-      </w:r>
-    </w:p>
-    <w:p>
-      <w:r>
-        <w:rPr>
-          <w:sz w:val="22"/>
-        </w:rPr>
-        <w:t xml:space="preserve">  • 82.6 % de asistencia</w:t>
-      </w:r>
-    </w:p>
-    <w:p>
-      <w:r>
-        <w:rPr>
-          <w:sz w:val="22"/>
-        </w:rPr>
-        <w:t xml:space="preserve">  • 4.1 horas promedio de sueño</w:t>
-      </w:r>
-    </w:p>
-    <w:p/>
-    <w:p>
-      <w:r>
-        <w:rPr>
-          <w:sz w:val="22"/>
-        </w:rPr>
-        <w:t>Las variables apuntan en la misma dirección, por eso el score lo ubica en el</w:t>
-      </w:r>
-    </w:p>
-    <w:p>
-      <w:r>
-        <w:rPr>
-          <w:sz w:val="22"/>
-        </w:rPr>
-        <w:t>nivel crítico y se recomienda tutoría obligatoria con seguimiento semanal.</w:t>
-      </w:r>
-    </w:p>
-    <w:p/>
-    <w:p>
-      <w:r>
-        <w:rPr>
-          <w:sz w:val="22"/>
-        </w:rPr>
-        <w:t>El estudiante puede 'mejorar' su score aumentando horas de estudio y asistencia</w:t>
-      </w:r>
-    </w:p>
-    <w:p>
-      <w:r>
-        <w:rPr>
-          <w:sz w:val="22"/>
-        </w:rPr>
-        <w:t>(las dos variables más controlables a corto plazo).</w:t>
-      </w:r>
-    </w:p>
-    <w:p>
-      <w:pPr>
-        <w:pStyle w:val="Heading1"/>
-      </w:pPr>
-      <w:r>
-        <w:rPr>
-          <w:color w:val="2C3E50"/>
-        </w:rPr>
-        <w:t>10. Scores adicionales derivados</w:t>
-      </w:r>
-    </w:p>
-    <w:p>
-      <w:pPr>
-        <w:pStyle w:val="Heading2"/>
-      </w:pPr>
-      <w:r>
-        <w:rPr>
-          <w:color w:val="2C3E50"/>
-        </w:rPr>
-        <w:t>Por qué más de un score</w:t>
-      </w:r>
-    </w:p>
-    <w:p>
-      <w:r>
-        <w:rPr>
-          <w:sz w:val="22"/>
-        </w:rPr>
-        <w:t>El score de riesgo es solo un ángulo del problema. A partir del mismo dataset</w:t>
-      </w:r>
-    </w:p>
-    <w:p>
-      <w:r>
-        <w:rPr>
-          <w:sz w:val="22"/>
-        </w:rPr>
-        <w:t>podemos construir scores complementarios que apoyan distintas decisiones de la</w:t>
-      </w:r>
-    </w:p>
-    <w:p>
-      <w:r>
-        <w:rPr>
-          <w:sz w:val="22"/>
-        </w:rPr>
-        <w:t>cátedra: priorizar tutorías, reconocer trayectorias positivas, detectar</w:t>
-      </w:r>
-    </w:p>
-    <w:p>
-      <w:r>
-        <w:rPr>
-          <w:sz w:val="22"/>
-        </w:rPr>
-        <w:t>ineficiencias en la técnica de estudio, alertar sobre desbalance vida-estudio,</w:t>
-      </w:r>
-    </w:p>
-    <w:p>
-      <w:r>
-        <w:rPr>
-          <w:sz w:val="22"/>
-        </w:rPr>
-        <w:t>predecir abandono, etc.</w:t>
-      </w:r>
-    </w:p>
-    <w:p/>
-    <w:p>
-      <w:r>
-        <w:rPr>
-          <w:sz w:val="22"/>
-        </w:rPr>
-        <w:t>Cada score se acota a la escala 0-100. Las normalizaciones por percentil hacen</w:t>
-      </w:r>
-    </w:p>
-    <w:p>
-      <w:r>
-        <w:rPr>
-          <w:sz w:val="22"/>
-        </w:rPr>
-        <w:t>que los scores sean robustos a la escala atípica de exam_score (max ≈ 51).</w:t>
-      </w:r>
-    </w:p>
-    <w:p/>
-    <w:p>
-      <w:r>
-        <w:rPr>
-          <w:sz w:val="22"/>
-        </w:rPr>
-        <w:t>Los 9 scores no son redundantes: cada uno apunta a una decisión distinta.</w:t>
-      </w:r>
-    </w:p>
-    <w:p>
-      <w:r>
-        <w:rPr>
-          <w:sz w:val="22"/>
-        </w:rPr>
-        <w:t>Pueden combinarse — por ejemplo, riesgo alto + potencial alto = prioridad máxima.</w:t>
-      </w:r>
-    </w:p>
-    <w:p/>
-    <w:p>
-      <w:r>
-        <w:rPr>
-          <w:sz w:val="22"/>
-        </w:rPr>
-        <w:t>ATENCIÓN — score_desercion es un PROXY. El dataset no tiene etiqueta real de</w:t>
-      </w:r>
-    </w:p>
-    <w:p>
-      <w:r>
-        <w:rPr>
-          <w:sz w:val="22"/>
-        </w:rPr>
-        <w:t>abandono, así que el score se construye con criterios de literatura (asistencia</w:t>
-      </w:r>
-    </w:p>
-    <w:p>
-      <w:r>
-        <w:rPr>
-          <w:sz w:val="22"/>
-        </w:rPr>
-        <w:t>como predictor más fuerte) pero NO se puede validar con AUC. Su uso debe ser</w:t>
-      </w:r>
-    </w:p>
-    <w:p>
-      <w:r>
-        <w:rPr>
-          <w:sz w:val="22"/>
-        </w:rPr>
-        <w:t>INDICATIVO, no decisorio.</w:t>
-      </w:r>
-    </w:p>
-    <w:p>
-      <w:pPr>
-        <w:pStyle w:val="Heading2"/>
-      </w:pPr>
-      <w:r>
-        <w:rPr>
-          <w:color w:val="2C3E50"/>
-        </w:rPr>
-        <w:t>Cómo combinar los scores en una decisión</w:t>
-      </w:r>
-    </w:p>
-    <w:p>
-      <w:r>
-        <w:rPr>
-          <w:sz w:val="22"/>
-        </w:rPr>
-        <w:t>Distintos scores cuentan historias distintas del MISMO estudiante:</w:t>
-      </w:r>
-    </w:p>
-    <w:p/>
-    <w:p>
-      <w:r>
-        <w:rPr>
-          <w:sz w:val="22"/>
-        </w:rPr>
-        <w:t>• riesgo alto + potencial alto         → prioridad máxima de tutoría (ROI alto)</w:t>
-      </w:r>
-    </w:p>
-    <w:p/>
-    <w:p>
-      <w:r>
-        <w:rPr>
-          <w:sz w:val="22"/>
-        </w:rPr>
-        <w:t>• riesgo alto + engagement bajo        → primero llamado de atención por</w:t>
-      </w:r>
-    </w:p>
-    <w:p>
-      <w:r>
-        <w:rPr>
-          <w:sz w:val="22"/>
-        </w:rPr>
-        <w:t xml:space="preserve">                                         compromiso, antes que tutoría académica</w:t>
-      </w:r>
-    </w:p>
-    <w:p/>
-    <w:p>
-      <w:r>
-        <w:rPr>
-          <w:sz w:val="22"/>
-        </w:rPr>
-        <w:t>• riesgo alto + eficiencia baja        → tutoría enfocada en MÉTODO de estudio,</w:t>
-      </w:r>
-    </w:p>
-    <w:p>
-      <w:r>
-        <w:rPr>
-          <w:sz w:val="22"/>
-        </w:rPr>
-        <w:t xml:space="preserve">                                         no en contenido</w:t>
-      </w:r>
-    </w:p>
-    <w:p/>
-    <w:p>
-      <w:r>
-        <w:rPr>
-          <w:sz w:val="22"/>
-        </w:rPr>
-        <w:t>• score_anomalia alto                  → caso atípico que requiere REVISIÓN</w:t>
-      </w:r>
-    </w:p>
-    <w:p>
-      <w:r>
-        <w:rPr>
-          <w:sz w:val="22"/>
-        </w:rPr>
-        <w:t xml:space="preserve">                                         HUMANA (problema personal, ansiedad</w:t>
-      </w:r>
-    </w:p>
-    <w:p>
-      <w:r>
-        <w:rPr>
-          <w:sz w:val="22"/>
-        </w:rPr>
-        <w:t xml:space="preserve">                                         de examen, error de datos)</w:t>
-      </w:r>
-    </w:p>
-    <w:p/>
-    <w:p>
-      <w:r>
-        <w:rPr>
-          <w:sz w:val="22"/>
-        </w:rPr>
-        <w:t>• score_habitos bajo                   → charla de bienestar antes que más</w:t>
-      </w:r>
-    </w:p>
-    <w:p>
-      <w:r>
-        <w:rPr>
-          <w:sz w:val="22"/>
-        </w:rPr>
-        <w:t xml:space="preserve">                                         horas de estudio (riesgo de burnout)</w:t>
-      </w:r>
-    </w:p>
-    <w:p/>
-    <w:p>
-      <w:r>
-        <w:rPr>
-          <w:sz w:val="22"/>
-        </w:rPr>
-        <w:t>• score_progreso alto                  → reconocer mejora aunque la nota</w:t>
-      </w:r>
-    </w:p>
-    <w:p>
-      <w:r>
-        <w:rPr>
-          <w:sz w:val="22"/>
-        </w:rPr>
-        <w:t xml:space="preserve">                                         actual no sea alta — refuerza motivación</w:t>
-      </w:r>
-    </w:p>
-    <w:p/>
-    <w:p>
-      <w:r>
-        <w:rPr>
-          <w:sz w:val="22"/>
-        </w:rPr>
-        <w:t>• score_desercion alto                 → activar plan de retención: contacto</w:t>
-      </w:r>
-    </w:p>
-    <w:p>
-      <w:r>
-        <w:rPr>
-          <w:sz w:val="22"/>
-        </w:rPr>
-        <w:t xml:space="preserve">                                         coordinador, tutor de carrera, posible</w:t>
-      </w:r>
-    </w:p>
-    <w:p>
-      <w:r>
-        <w:rPr>
-          <w:sz w:val="22"/>
-        </w:rPr>
-        <w:t xml:space="preserve">                                         entrevista con bienestar estudiantil.</w:t>
-      </w:r>
-    </w:p>
-    <w:p>
-      <w:r>
-        <w:rPr>
-          <w:sz w:val="22"/>
-        </w:rPr>
-        <w:t xml:space="preserve">                                         RECORDAR: es proxy, no decisión final</w:t>
-      </w:r>
-    </w:p>
-    <w:p>
-      <w:pPr>
-        <w:pStyle w:val="Heading1"/>
-      </w:pPr>
-      <w:r>
-        <w:rPr>
-          <w:color w:val="2C3E50"/>
-        </w:rPr>
-        <w:t>Cómo se calcula cada score</w:t>
-        <w:br/>
-        <w:t>(11 fórmulas — una por página)</w:t>
-      </w:r>
-    </w:p>
-    <w:p>
-      <w:pPr>
-        <w:pStyle w:val="Heading2"/>
-      </w:pPr>
-      <w:r>
-        <w:rPr>
-          <w:color w:val="2C3E50"/>
-        </w:rPr>
-        <w:t>Notación común a todas las fórmulas</w:t>
+        <w:t>Helpers y notación usados en las fórmulas</w:t>
       </w:r>
     </w:p>
     <w:p>

</xml_diff>